<commit_message>
Review of files for sprint 2
</commit_message>
<xml_diff>
--- a/docs/sprint2/test-plan.docx
+++ b/docs/sprint2/test-plan.docx
@@ -5,7 +5,6 @@
     <w:p>
       <w:pPr>
         <w:pStyle w:val="Heading1"/>
-        <w:pBdr/>
         <w:shd w:val="clear" w:fill="auto"/>
         <w:spacing w:before="240" w:after="240"/>
         <w:rPr/>
@@ -18,7 +17,6 @@
     <w:p>
       <w:pPr>
         <w:pStyle w:val="normal1"/>
-        <w:pBdr/>
         <w:shd w:val="clear" w:fill="auto"/>
         <w:spacing w:lineRule="auto" w:line="300"/>
         <w:rPr>
@@ -43,7 +41,6 @@
     <w:p>
       <w:pPr>
         <w:pStyle w:val="normal1"/>
-        <w:pBdr/>
         <w:shd w:val="clear" w:fill="auto"/>
         <w:spacing w:lineRule="auto" w:line="300"/>
         <w:rPr>
@@ -68,7 +65,6 @@
     <w:p>
       <w:pPr>
         <w:pStyle w:val="normal1"/>
-        <w:pBdr/>
         <w:shd w:val="clear" w:fill="auto"/>
         <w:spacing w:lineRule="auto" w:line="300"/>
         <w:rPr>
@@ -93,7 +89,6 @@
     <w:p>
       <w:pPr>
         <w:pStyle w:val="normal1"/>
-        <w:pBdr/>
         <w:shd w:val="clear" w:fill="auto"/>
         <w:spacing w:lineRule="auto" w:line="300" w:before="0" w:after="225"/>
         <w:rPr>
@@ -118,7 +113,6 @@
     <w:p>
       <w:pPr>
         <w:pStyle w:val="Heading2"/>
-        <w:pBdr/>
         <w:shd w:val="clear" w:fill="auto"/>
         <w:spacing w:lineRule="auto" w:line="240" w:before="0" w:after="225"/>
         <w:rPr/>
@@ -131,7 +125,6 @@
     <w:p>
       <w:pPr>
         <w:pStyle w:val="normal1"/>
-        <w:pBdr/>
         <w:shd w:val="clear" w:fill="auto"/>
         <w:spacing w:lineRule="auto" w:line="300"/>
         <w:rPr>
@@ -156,7 +149,6 @@
           <w:ilvl w:val="0"/>
           <w:numId w:val="1"/>
         </w:numPr>
-        <w:pBdr/>
         <w:shd w:val="clear" w:fill="auto"/>
         <w:spacing w:lineRule="auto" w:line="300"/>
         <w:ind w:hanging="360" w:start="600"/>
@@ -184,7 +176,6 @@
           <w:ilvl w:val="0"/>
           <w:numId w:val="1"/>
         </w:numPr>
-        <w:pBdr/>
         <w:shd w:val="clear" w:fill="auto"/>
         <w:spacing w:lineRule="auto" w:line="300"/>
         <w:ind w:hanging="360" w:start="600"/>
@@ -206,7 +197,6 @@
           <w:ilvl w:val="1"/>
           <w:numId w:val="2"/>
         </w:numPr>
-        <w:pBdr/>
         <w:shd w:val="clear" w:fill="auto"/>
         <w:spacing w:lineRule="auto" w:line="300"/>
         <w:ind w:hanging="360" w:start="1200"/>
@@ -226,7 +216,6 @@
           <w:ilvl w:val="1"/>
           <w:numId w:val="2"/>
         </w:numPr>
-        <w:pBdr/>
         <w:shd w:val="clear" w:fill="auto"/>
         <w:spacing w:lineRule="auto" w:line="300"/>
         <w:ind w:hanging="360" w:start="1200"/>
@@ -246,7 +235,6 @@
           <w:ilvl w:val="1"/>
           <w:numId w:val="2"/>
         </w:numPr>
-        <w:pBdr/>
         <w:shd w:val="clear" w:fill="auto"/>
         <w:spacing w:lineRule="auto" w:line="300"/>
         <w:ind w:hanging="360" w:start="1200"/>
@@ -266,7 +254,6 @@
           <w:ilvl w:val="0"/>
           <w:numId w:val="1"/>
         </w:numPr>
-        <w:pBdr/>
         <w:shd w:val="clear" w:fill="auto"/>
         <w:spacing w:lineRule="auto" w:line="300"/>
         <w:ind w:hanging="360" w:start="600"/>
@@ -290,7 +277,6 @@
     <w:p>
       <w:pPr>
         <w:pStyle w:val="normal1"/>
-        <w:pBdr/>
         <w:shd w:val="clear" w:fill="auto"/>
         <w:spacing w:lineRule="auto" w:line="300"/>
         <w:rPr>
@@ -315,7 +301,6 @@
           <w:ilvl w:val="0"/>
           <w:numId w:val="3"/>
         </w:numPr>
-        <w:pBdr/>
         <w:shd w:val="clear" w:fill="auto"/>
         <w:spacing w:lineRule="auto" w:line="300"/>
         <w:ind w:hanging="360" w:start="600"/>
@@ -335,7 +320,6 @@
           <w:ilvl w:val="0"/>
           <w:numId w:val="3"/>
         </w:numPr>
-        <w:pBdr/>
         <w:shd w:val="clear" w:fill="auto"/>
         <w:spacing w:lineRule="auto" w:line="300"/>
         <w:ind w:hanging="360" w:start="600"/>
@@ -355,7 +339,6 @@
           <w:ilvl w:val="0"/>
           <w:numId w:val="3"/>
         </w:numPr>
-        <w:pBdr/>
         <w:shd w:val="clear" w:fill="auto"/>
         <w:spacing w:lineRule="auto" w:line="300"/>
         <w:ind w:hanging="360" w:start="600"/>
@@ -375,7 +358,6 @@
           <w:ilvl w:val="0"/>
           <w:numId w:val="3"/>
         </w:numPr>
-        <w:pBdr/>
         <w:shd w:val="clear" w:fill="auto"/>
         <w:spacing w:lineRule="auto" w:line="300"/>
         <w:ind w:hanging="360" w:start="600"/>
@@ -391,18 +373,13 @@
     <w:p>
       <w:pPr>
         <w:pStyle w:val="Heading2"/>
-        <w:pBdr/>
         <w:shd w:val="clear" w:fill="auto"/>
         <w:spacing w:lineRule="auto" w:line="240" w:before="300" w:after="225"/>
         <w:rPr/>
       </w:pPr>
       <w:r>
         <w:rPr/>
-        <w:t>2</w:t>
-      </w:r>
-      <w:r>
-        <w:rPr/>
-        <w:t>. Офіційний перелік питань Замовнику від Керівника тестування (КТ) з тегом [ПІДТВ.]</w:t>
+        <w:t>2. Офіційний перелік питань Замовнику від Керівника тестування (КТ) з тегом [ПІДТВ.]</w:t>
       </w:r>
     </w:p>
     <w:p>
@@ -412,7 +389,6 @@
           <w:ilvl w:val="0"/>
           <w:numId w:val="4"/>
         </w:numPr>
-        <w:pBdr/>
         <w:shd w:val="clear" w:fill="auto"/>
         <w:spacing w:lineRule="auto" w:line="300"/>
         <w:ind w:hanging="360" w:start="600"/>
@@ -454,7 +430,6 @@
           <w:ilvl w:val="0"/>
           <w:numId w:val="4"/>
         </w:numPr>
-        <w:pBdr/>
         <w:shd w:val="clear" w:fill="auto"/>
         <w:spacing w:lineRule="auto" w:line="300"/>
         <w:ind w:hanging="360" w:start="600"/>
@@ -482,7 +457,6 @@
           <w:ilvl w:val="0"/>
           <w:numId w:val="4"/>
         </w:numPr>
-        <w:pBdr/>
         <w:shd w:val="clear" w:fill="auto"/>
         <w:spacing w:lineRule="auto" w:line="300"/>
         <w:ind w:hanging="360" w:start="600"/>
@@ -524,7 +498,6 @@
           <w:ilvl w:val="0"/>
           <w:numId w:val="4"/>
         </w:numPr>
-        <w:pBdr/>
         <w:shd w:val="clear" w:fill="auto"/>
         <w:spacing w:lineRule="auto" w:line="300"/>
         <w:ind w:hanging="360" w:start="600"/>
@@ -566,7 +539,6 @@
           <w:ilvl w:val="0"/>
           <w:numId w:val="4"/>
         </w:numPr>
-        <w:pBdr/>
         <w:shd w:val="clear" w:fill="auto"/>
         <w:spacing w:lineRule="auto" w:line="300"/>
         <w:ind w:hanging="360" w:start="600"/>
@@ -594,7 +566,6 @@
           <w:ilvl w:val="0"/>
           <w:numId w:val="4"/>
         </w:numPr>
-        <w:pBdr/>
         <w:shd w:val="clear" w:fill="auto"/>
         <w:spacing w:lineRule="auto" w:line="300"/>
         <w:ind w:hanging="360" w:start="600"/>
@@ -618,22 +589,17 @@
     <w:p>
       <w:pPr>
         <w:pStyle w:val="Heading2"/>
-        <w:pBdr/>
         <w:shd w:val="clear" w:fill="auto"/>
         <w:rPr/>
       </w:pPr>
       <w:r>
         <w:rPr/>
-        <w:t>3</w:t>
-      </w:r>
-      <w:r>
-        <w:rPr/>
-        <w:t>. Сім рівнів тестування продукту «ФінКит»</w:t>
+        <w:t>3. Сім рівнів тестування продукту «ФінКит»</w:t>
       </w:r>
     </w:p>
     <w:tbl>
       <w:tblPr>
-        <w:tblStyle w:val="Table2"/>
+        <w:tblStyle w:val="Table1"/>
         <w:tblW w:w="9360" w:type="dxa"/>
         <w:jc w:val="start"/>
         <w:tblInd w:w="0" w:type="dxa"/>
@@ -670,18 +636,57 @@
           </w:tcPr>
           <w:p>
             <w:pPr>
-              <w:pStyle w:val="normal1"/>
+              <w:pStyle w:val="normal2"/>
               <w:pBdr/>
               <w:shd w:val="clear" w:fill="auto"/>
               <w:spacing w:lineRule="auto" w:line="300" w:before="120" w:after="120"/>
               <w:rPr>
                 <w:rFonts w:ascii="Arial" w:hAnsi="Arial" w:eastAsia="Arial" w:cs="Arial"/>
-                <w:shd w:fill="auto" w:val="clear"/>
-              </w:rPr>
-            </w:pPr>
-            <w:r>
-              <w:rPr>
-                <w:rFonts w:eastAsia="Arial" w:cs="Arial"/>
+                <w:b/>
+                <w:bCs/>
+                <w:shd w:fill="auto" w:val="clear"/>
+              </w:rPr>
+            </w:pPr>
+            <w:r>
+              <w:rPr>
+                <w:rFonts w:eastAsia="Arial" w:cs="Arial" w:ascii="Arial" w:hAnsi="Arial"/>
+                <w:b/>
+                <w:bCs/>
+                <w:shd w:fill="auto" w:val="clear"/>
+              </w:rPr>
+              <w:t>№</w:t>
+            </w:r>
+          </w:p>
+        </w:tc>
+        <w:tc>
+          <w:tcPr>
+            <w:tcW w:w="1872" w:type="dxa"/>
+            <w:tcBorders>
+              <w:top w:val="single" w:sz="6" w:space="0" w:color="CCCCCC"/>
+              <w:start w:val="single" w:sz="6" w:space="0" w:color="CCCCCC"/>
+              <w:bottom w:val="single" w:sz="6" w:space="0" w:color="CCCCCC"/>
+              <w:end w:val="single" w:sz="6" w:space="0" w:color="CCCCCC"/>
+            </w:tcBorders>
+            <w:shd w:fill="E9ECEF" w:val="clear"/>
+          </w:tcPr>
+          <w:p>
+            <w:pPr>
+              <w:pStyle w:val="normal2"/>
+              <w:pBdr/>
+              <w:shd w:val="clear" w:fill="auto"/>
+              <w:spacing w:lineRule="auto" w:line="300" w:before="120" w:after="120"/>
+              <w:rPr>
+                <w:rFonts w:ascii="Arial" w:hAnsi="Arial" w:eastAsia="Arial" w:cs="Arial"/>
+                <w:b/>
+                <w:bCs/>
+                <w:shd w:fill="auto" w:val="clear"/>
+              </w:rPr>
+            </w:pPr>
+            <w:r>
+              <w:rPr>
+                <w:rFonts w:eastAsia="Arial" w:cs="Arial" w:ascii="Arial" w:hAnsi="Arial"/>
+                <w:b/>
+                <w:bCs/>
                 <w:shd w:fill="auto" w:val="clear"/>
               </w:rPr>
               <w:t>Рівень тестування</w:t>
@@ -701,21 +706,25 @@
           </w:tcPr>
           <w:p>
             <w:pPr>
-              <w:pStyle w:val="normal1"/>
+              <w:pStyle w:val="normal2"/>
               <w:pBdr/>
               <w:shd w:val="clear" w:fill="auto"/>
               <w:spacing w:lineRule="auto" w:line="300" w:before="120" w:after="120"/>
               <w:rPr>
                 <w:rFonts w:ascii="Arial" w:hAnsi="Arial" w:eastAsia="Arial" w:cs="Arial"/>
-                <w:shd w:fill="auto" w:val="clear"/>
-              </w:rPr>
-            </w:pPr>
-            <w:r>
-              <w:rPr>
-                <w:rFonts w:eastAsia="Arial" w:cs="Arial"/>
-                <w:shd w:fill="auto" w:val="clear"/>
-              </w:rPr>
-              <w:t>Ціль (що і навіщо перевіряємо)</w:t>
+                <w:b/>
+                <w:bCs/>
+                <w:shd w:fill="auto" w:val="clear"/>
+              </w:rPr>
+            </w:pPr>
+            <w:r>
+              <w:rPr>
+                <w:rFonts w:eastAsia="Arial" w:cs="Arial" w:ascii="Arial" w:hAnsi="Arial"/>
+                <w:b/>
+                <w:bCs/>
+                <w:shd w:fill="auto" w:val="clear"/>
+              </w:rPr>
+              <w:t>Пріоритет</w:t>
             </w:r>
           </w:p>
         </w:tc>
@@ -732,21 +741,25 @@
           </w:tcPr>
           <w:p>
             <w:pPr>
-              <w:pStyle w:val="normal1"/>
+              <w:pStyle w:val="normal2"/>
               <w:pBdr/>
               <w:shd w:val="clear" w:fill="auto"/>
               <w:spacing w:lineRule="auto" w:line="300" w:before="120" w:after="120"/>
               <w:rPr>
                 <w:rFonts w:ascii="Arial" w:hAnsi="Arial" w:eastAsia="Arial" w:cs="Arial"/>
-                <w:shd w:fill="auto" w:val="clear"/>
-              </w:rPr>
-            </w:pPr>
-            <w:r>
-              <w:rPr>
-                <w:rFonts w:eastAsia="Arial" w:cs="Arial"/>
-                <w:shd w:fill="auto" w:val="clear"/>
-              </w:rPr>
-              <w:t>Опис (як саме виконується)</w:t>
+                <w:b/>
+                <w:bCs/>
+                <w:shd w:fill="auto" w:val="clear"/>
+              </w:rPr>
+            </w:pPr>
+            <w:r>
+              <w:rPr>
+                <w:rFonts w:eastAsia="Arial" w:cs="Arial" w:ascii="Arial" w:hAnsi="Arial"/>
+                <w:b/>
+                <w:bCs/>
+                <w:shd w:fill="auto" w:val="clear"/>
+              </w:rPr>
+              <w:t>Об'єкт та Інструменти</w:t>
             </w:r>
           </w:p>
         </w:tc>
@@ -763,74 +776,25 @@
           </w:tcPr>
           <w:p>
             <w:pPr>
-              <w:pStyle w:val="normal1"/>
+              <w:pStyle w:val="normal2"/>
               <w:pBdr/>
               <w:shd w:val="clear" w:fill="auto"/>
               <w:spacing w:lineRule="auto" w:line="300" w:before="120" w:after="120"/>
               <w:rPr>
                 <w:rFonts w:ascii="Arial" w:hAnsi="Arial" w:eastAsia="Arial" w:cs="Arial"/>
-                <w:shd w:fill="auto" w:val="clear"/>
-              </w:rPr>
-            </w:pPr>
-            <w:r>
-              <w:rPr>
-                <w:rFonts w:eastAsia="Arial" w:cs="Arial"/>
-                <w:shd w:fill="auto" w:val="clear"/>
-              </w:rPr>
-              <w:t>Хто і коли</w:t>
-            </w:r>
-          </w:p>
-        </w:tc>
-        <w:tc>
-          <w:tcPr>
-            <w:tcW w:w="1872" w:type="dxa"/>
-            <w:tcBorders>
-              <w:top w:val="single" w:sz="6" w:space="0" w:color="CCCCCC"/>
-              <w:start w:val="single" w:sz="6" w:space="0" w:color="CCCCCC"/>
-              <w:bottom w:val="single" w:sz="6" w:space="0" w:color="CCCCCC"/>
-              <w:end w:val="single" w:sz="6" w:space="0" w:color="CCCCCC"/>
-            </w:tcBorders>
-            <w:shd w:fill="E9ECEF" w:val="clear"/>
-          </w:tcPr>
-          <w:p>
-            <w:pPr>
-              <w:pStyle w:val="normal1"/>
-              <w:pBdr/>
-              <w:shd w:val="clear" w:fill="auto"/>
-              <w:spacing w:lineRule="auto" w:line="300" w:before="120" w:after="120"/>
-              <w:rPr>
-                <w:rFonts w:ascii="Arial" w:hAnsi="Arial" w:eastAsia="Arial" w:cs="Arial"/>
-                <w:shd w:fill="auto" w:val="clear"/>
-              </w:rPr>
-            </w:pPr>
-            <w:r>
-              <w:rPr>
-                <w:rFonts w:eastAsia="Arial" w:cs="Arial"/>
-                <w:shd w:fill="auto" w:val="clear"/>
-              </w:rPr>
-              <w:t>Інструменти та середовище</w:t>
-            </w:r>
-          </w:p>
-          <w:p>
-            <w:pPr>
-              <w:pStyle w:val="normal1"/>
-              <w:keepNext w:val="false"/>
-              <w:keepLines w:val="false"/>
-              <w:widowControl w:val="false"/>
-              <w:pBdr/>
-              <w:shd w:val="clear" w:fill="auto"/>
-              <w:spacing w:lineRule="auto" w:line="240" w:before="0" w:after="0"/>
-              <w:ind w:hanging="0" w:start="0" w:end="0"/>
-              <w:jc w:val="start"/>
-              <w:rPr>
-                <w:rFonts w:ascii="Arial" w:hAnsi="Arial" w:eastAsia="Arial" w:cs="Arial"/>
-              </w:rPr>
-            </w:pPr>
-            <w:r>
-              <w:rPr>
-                <w:rFonts w:eastAsia="Arial" w:cs="Arial"/>
-              </w:rPr>
-              <w:t xml:space="preserve"> </w:t>
+                <w:b/>
+                <w:bCs/>
+                <w:shd w:fill="auto" w:val="clear"/>
+              </w:rPr>
+            </w:pPr>
+            <w:r>
+              <w:rPr>
+                <w:rFonts w:eastAsia="Arial" w:cs="Arial" w:ascii="Arial" w:hAnsi="Arial"/>
+                <w:b/>
+                <w:bCs/>
+                <w:shd w:fill="auto" w:val="clear"/>
+              </w:rPr>
+              <w:t>Опис виконання у навчальному середовищі (ParaBank Demo)</w:t>
             </w:r>
           </w:p>
         </w:tc>
@@ -850,7 +814,7 @@
           </w:tcPr>
           <w:p>
             <w:pPr>
-              <w:pStyle w:val="normal1"/>
+              <w:pStyle w:val="normal2"/>
               <w:pBdr/>
               <w:shd w:val="clear" w:fill="auto"/>
               <w:spacing w:lineRule="auto" w:line="300" w:before="120" w:after="120"/>
@@ -862,11 +826,11 @@
             </w:pPr>
             <w:r>
               <w:rPr>
-                <w:rFonts w:eastAsia="Arial" w:cs="Arial"/>
-                <w:b/>
-                <w:bCs/>
-              </w:rPr>
-              <w:t>1. Модульне (Unit)</w:t>
+                <w:rFonts w:eastAsia="Arial" w:cs="Arial" w:ascii="Arial" w:hAnsi="Arial"/>
+                <w:b/>
+                <w:bCs/>
+              </w:rPr>
+              <w:t>1</w:t>
             </w:r>
           </w:p>
         </w:tc>
@@ -883,19 +847,23 @@
           </w:tcPr>
           <w:p>
             <w:pPr>
-              <w:pStyle w:val="normal1"/>
+              <w:pStyle w:val="normal2"/>
               <w:pBdr/>
               <w:shd w:val="clear" w:fill="auto"/>
               <w:spacing w:lineRule="auto" w:line="300" w:before="120" w:after="120"/>
               <w:rPr>
                 <w:rFonts w:ascii="Arial" w:hAnsi="Arial" w:eastAsia="Arial" w:cs="Arial"/>
-              </w:rPr>
-            </w:pPr>
-            <w:r>
-              <w:rPr>
-                <w:rFonts w:eastAsia="Arial" w:cs="Arial"/>
-              </w:rPr>
-              <w:t>Перевірка математичної точності ануїтету LoanCalculator, коректності валідацій TransferValidator та правил овердрафту AccountLedger.</w:t>
+                <w:b/>
+                <w:bCs/>
+              </w:rPr>
+            </w:pPr>
+            <w:r>
+              <w:rPr>
+                <w:rFonts w:eastAsia="Arial" w:cs="Arial" w:ascii="Arial" w:hAnsi="Arial"/>
+                <w:b/>
+                <w:bCs/>
+              </w:rPr>
+              <w:t>Модульне тестування (Unit Testing)</w:t>
             </w:r>
           </w:p>
         </w:tc>
@@ -912,19 +880,25 @@
           </w:tcPr>
           <w:p>
             <w:pPr>
-              <w:pStyle w:val="normal1"/>
+              <w:pStyle w:val="normal2"/>
               <w:pBdr/>
               <w:shd w:val="clear" w:fill="auto"/>
               <w:spacing w:lineRule="auto" w:line="300" w:before="120" w:after="120"/>
               <w:rPr>
                 <w:rFonts w:ascii="Arial" w:hAnsi="Arial" w:eastAsia="Arial" w:cs="Arial"/>
-              </w:rPr>
-            </w:pPr>
-            <w:r>
-              <w:rPr>
-                <w:rFonts w:eastAsia="Arial" w:cs="Arial"/>
-              </w:rPr>
-              <w:t>Автоматизовані юніт-тести JUnit 5 для класів модуля ua.kpi.tzyapz.finkit. Граничні значення (1000, 1000000 грн) та перевірка винятків assertThrows.</w:t>
+                <w:b/>
+                <w:bCs/>
+                <w:color w:val="FF0000"/>
+              </w:rPr>
+            </w:pPr>
+            <w:r>
+              <w:rPr>
+                <w:rFonts w:eastAsia="Arial" w:cs="Arial" w:ascii="Arial" w:hAnsi="Arial"/>
+                <w:b/>
+                <w:bCs/>
+                <w:color w:val="FF0000"/>
+              </w:rPr>
+              <w:t>High</w:t>
             </w:r>
           </w:p>
         </w:tc>
@@ -941,19 +915,44 @@
           </w:tcPr>
           <w:p>
             <w:pPr>
-              <w:pStyle w:val="normal1"/>
+              <w:pStyle w:val="normal2"/>
               <w:pBdr/>
               <w:shd w:val="clear" w:fill="auto"/>
-              <w:spacing w:lineRule="auto" w:line="300" w:before="120" w:after="120"/>
-              <w:rPr>
-                <w:rFonts w:ascii="Arial" w:hAnsi="Arial" w:eastAsia="Arial" w:cs="Arial"/>
-              </w:rPr>
-            </w:pPr>
-            <w:r>
-              <w:rPr>
-                <w:rFonts w:eastAsia="Arial" w:cs="Arial"/>
-              </w:rPr>
-              <w:t>Ліза (ІТ), Спринти 4–5</w:t>
+              <w:spacing w:lineRule="auto" w:line="300"/>
+              <w:rPr>
+                <w:rFonts w:ascii="Arial" w:hAnsi="Arial" w:eastAsia="Arial" w:cs="Arial"/>
+                <w:b/>
+                <w:bCs/>
+              </w:rPr>
+            </w:pPr>
+            <w:r>
+              <w:rPr>
+                <w:rFonts w:eastAsia="Arial" w:cs="Arial" w:ascii="Arial" w:hAnsi="Arial"/>
+                <w:b/>
+                <w:bCs/>
+              </w:rPr>
+              <w:t>Модуль ua.kpi.tzyapz.finkit</w:t>
+            </w:r>
+          </w:p>
+          <w:p>
+            <w:pPr>
+              <w:pStyle w:val="normal2"/>
+              <w:pBdr/>
+              <w:shd w:val="clear" w:fill="auto"/>
+              <w:spacing w:lineRule="auto" w:line="300" w:before="120" w:after="120"/>
+              <w:rPr>
+                <w:rFonts w:ascii="Arial" w:hAnsi="Arial" w:eastAsia="Arial" w:cs="Arial"/>
+                <w:b/>
+                <w:bCs/>
+              </w:rPr>
+            </w:pPr>
+            <w:r>
+              <w:rPr>
+                <w:rFonts w:eastAsia="Arial" w:cs="Arial" w:ascii="Arial" w:hAnsi="Arial"/>
+                <w:b/>
+                <w:bCs/>
+              </w:rPr>
+              <w:t>(JUnit 5, AssertJ, Maven)</w:t>
             </w:r>
           </w:p>
         </w:tc>
@@ -970,19 +969,23 @@
           </w:tcPr>
           <w:p>
             <w:pPr>
-              <w:pStyle w:val="normal1"/>
+              <w:pStyle w:val="normal2"/>
               <w:pBdr/>
               <w:shd w:val="clear" w:fill="auto"/>
               <w:spacing w:lineRule="auto" w:line="300" w:before="120" w:after="120"/>
               <w:rPr>
                 <w:rFonts w:ascii="Arial" w:hAnsi="Arial" w:eastAsia="Arial" w:cs="Arial"/>
-              </w:rPr>
-            </w:pPr>
-            <w:r>
-              <w:rPr>
-                <w:rFonts w:eastAsia="Arial" w:cs="Arial"/>
-              </w:rPr>
-              <w:t>JDK 17, Maven, JUnit 5, IntelliJ IDEA</w:t>
+                <w:b/>
+                <w:bCs/>
+              </w:rPr>
+            </w:pPr>
+            <w:r>
+              <w:rPr>
+                <w:rFonts w:eastAsia="Arial" w:cs="Arial" w:ascii="Arial" w:hAnsi="Arial"/>
+                <w:b/>
+                <w:bCs/>
+              </w:rPr>
+              <w:t>Автоматизоване тестування класів LoanCalculator (ануїтет, граничні суми 1 000–1 000 000 грн), TransferValidator (IBAN MOD-97) та AccountLedger (атомарність списання/зарахування).</w:t>
             </w:r>
           </w:p>
         </w:tc>
@@ -1002,7 +1005,7 @@
           </w:tcPr>
           <w:p>
             <w:pPr>
-              <w:pStyle w:val="normal1"/>
+              <w:pStyle w:val="normal2"/>
               <w:pBdr/>
               <w:shd w:val="clear" w:fill="auto"/>
               <w:spacing w:lineRule="auto" w:line="300" w:before="120" w:after="120"/>
@@ -1015,12 +1018,12 @@
             </w:pPr>
             <w:r>
               <w:rPr>
-                <w:rFonts w:eastAsia="Arial" w:cs="Arial"/>
-                <w:b/>
-                <w:bCs/>
-                <w:shd w:fill="auto" w:val="clear"/>
-              </w:rPr>
-              <w:t>2. Інтеграційне (Integration)</w:t>
+                <w:rFonts w:eastAsia="Arial" w:cs="Arial" w:ascii="Arial" w:hAnsi="Arial"/>
+                <w:b/>
+                <w:bCs/>
+                <w:shd w:fill="auto" w:val="clear"/>
+              </w:rPr>
+              <w:t>2</w:t>
             </w:r>
           </w:p>
         </w:tc>
@@ -1037,21 +1040,25 @@
           </w:tcPr>
           <w:p>
             <w:pPr>
-              <w:pStyle w:val="normal1"/>
+              <w:pStyle w:val="normal2"/>
               <w:pBdr/>
               <w:shd w:val="clear" w:fill="auto"/>
               <w:spacing w:lineRule="auto" w:line="300" w:before="120" w:after="120"/>
               <w:rPr>
                 <w:rFonts w:ascii="Arial" w:hAnsi="Arial" w:eastAsia="Arial" w:cs="Arial"/>
-                <w:shd w:fill="auto" w:val="clear"/>
-              </w:rPr>
-            </w:pPr>
-            <w:r>
-              <w:rPr>
-                <w:rFonts w:eastAsia="Arial" w:cs="Arial"/>
-                <w:shd w:fill="auto" w:val="clear"/>
-              </w:rPr>
-              <w:t>Перевірка взаємодії модуля валідації переказів із ліджером рахунку та оновленням балансу.</w:t>
+                <w:b/>
+                <w:bCs/>
+                <w:shd w:fill="auto" w:val="clear"/>
+              </w:rPr>
+            </w:pPr>
+            <w:r>
+              <w:rPr>
+                <w:rFonts w:eastAsia="Arial" w:cs="Arial" w:ascii="Arial" w:hAnsi="Arial"/>
+                <w:b/>
+                <w:bCs/>
+                <w:shd w:fill="auto" w:val="clear"/>
+              </w:rPr>
+              <w:t>Інтеграційне тестування (Integration Testing)</w:t>
             </w:r>
           </w:p>
         </w:tc>
@@ -1068,21 +1075,27 @@
           </w:tcPr>
           <w:p>
             <w:pPr>
-              <w:pStyle w:val="normal1"/>
+              <w:pStyle w:val="normal2"/>
               <w:pBdr/>
               <w:shd w:val="clear" w:fill="auto"/>
               <w:spacing w:lineRule="auto" w:line="300" w:before="120" w:after="120"/>
               <w:rPr>
                 <w:rFonts w:ascii="Arial" w:hAnsi="Arial" w:eastAsia="Arial" w:cs="Arial"/>
-                <w:shd w:fill="auto" w:val="clear"/>
-              </w:rPr>
-            </w:pPr>
-            <w:r>
-              <w:rPr>
-                <w:rFonts w:eastAsia="Arial" w:cs="Arial"/>
-                <w:shd w:fill="auto" w:val="clear"/>
-              </w:rPr>
-              <w:t>Тестування ланцюжка: TransferValidator.validate() -&gt; AccountLedger.withdraw() -&gt; AccountLedger.deposit(). Перевірка атомарності транзакції.</w:t>
+                <w:b/>
+                <w:bCs/>
+                <w:color w:val="FF0000"/>
+                <w:shd w:fill="auto" w:val="clear"/>
+              </w:rPr>
+            </w:pPr>
+            <w:r>
+              <w:rPr>
+                <w:rFonts w:eastAsia="Arial" w:cs="Arial" w:ascii="Arial" w:hAnsi="Arial"/>
+                <w:b/>
+                <w:bCs/>
+                <w:color w:val="FF0000"/>
+                <w:shd w:fill="auto" w:val="clear"/>
+              </w:rPr>
+              <w:t>High</w:t>
             </w:r>
           </w:p>
         </w:tc>
@@ -1099,21 +1112,48 @@
           </w:tcPr>
           <w:p>
             <w:pPr>
-              <w:pStyle w:val="normal1"/>
+              <w:pStyle w:val="normal2"/>
               <w:pBdr/>
               <w:shd w:val="clear" w:fill="auto"/>
-              <w:spacing w:lineRule="auto" w:line="300" w:before="120" w:after="120"/>
-              <w:rPr>
-                <w:rFonts w:ascii="Arial" w:hAnsi="Arial" w:eastAsia="Arial" w:cs="Arial"/>
-                <w:shd w:fill="auto" w:val="clear"/>
-              </w:rPr>
-            </w:pPr>
-            <w:r>
-              <w:rPr>
-                <w:rFonts w:eastAsia="Arial" w:cs="Arial"/>
-                <w:shd w:fill="auto" w:val="clear"/>
-              </w:rPr>
-              <w:t>Ліза (ІТ), Спринти 4–5</w:t>
+              <w:spacing w:lineRule="auto" w:line="300"/>
+              <w:rPr>
+                <w:rFonts w:ascii="Arial" w:hAnsi="Arial" w:eastAsia="Arial" w:cs="Arial"/>
+                <w:b/>
+                <w:bCs/>
+                <w:shd w:fill="auto" w:val="clear"/>
+              </w:rPr>
+            </w:pPr>
+            <w:r>
+              <w:rPr>
+                <w:rFonts w:eastAsia="Arial" w:cs="Arial" w:ascii="Arial" w:hAnsi="Arial"/>
+                <w:b/>
+                <w:bCs/>
+                <w:shd w:fill="auto" w:val="clear"/>
+              </w:rPr>
+              <w:t>Взаємодія валідатора та ліджера</w:t>
+            </w:r>
+          </w:p>
+          <w:p>
+            <w:pPr>
+              <w:pStyle w:val="normal2"/>
+              <w:pBdr/>
+              <w:shd w:val="clear" w:fill="auto"/>
+              <w:spacing w:lineRule="auto" w:line="300" w:before="120" w:after="120"/>
+              <w:rPr>
+                <w:rFonts w:ascii="Arial" w:hAnsi="Arial" w:eastAsia="Arial" w:cs="Arial"/>
+                <w:b/>
+                <w:bCs/>
+                <w:shd w:fill="auto" w:val="clear"/>
+              </w:rPr>
+            </w:pPr>
+            <w:r>
+              <w:rPr>
+                <w:rFonts w:eastAsia="Arial" w:cs="Arial" w:ascii="Arial" w:hAnsi="Arial"/>
+                <w:b/>
+                <w:bCs/>
+                <w:shd w:fill="auto" w:val="clear"/>
+              </w:rPr>
+              <w:t>(JUnit 5, Mockito)</w:t>
             </w:r>
           </w:p>
         </w:tc>
@@ -1130,21 +1170,25 @@
           </w:tcPr>
           <w:p>
             <w:pPr>
-              <w:pStyle w:val="normal1"/>
+              <w:pStyle w:val="normal2"/>
               <w:pBdr/>
               <w:shd w:val="clear" w:fill="auto"/>
               <w:spacing w:lineRule="auto" w:line="300" w:before="120" w:after="120"/>
               <w:rPr>
                 <w:rFonts w:ascii="Arial" w:hAnsi="Arial" w:eastAsia="Arial" w:cs="Arial"/>
-                <w:shd w:fill="auto" w:val="clear"/>
-              </w:rPr>
-            </w:pPr>
-            <w:r>
-              <w:rPr>
-                <w:rFonts w:eastAsia="Arial" w:cs="Arial"/>
-                <w:shd w:fill="auto" w:val="clear"/>
-              </w:rPr>
-              <w:t>JUnit 5, Mockito, Spring Test Context</w:t>
+                <w:b/>
+                <w:bCs/>
+                <w:shd w:fill="auto" w:val="clear"/>
+              </w:rPr>
+            </w:pPr>
+            <w:r>
+              <w:rPr>
+                <w:rFonts w:eastAsia="Arial" w:cs="Arial" w:ascii="Arial" w:hAnsi="Arial"/>
+                <w:b/>
+                <w:bCs/>
+                <w:shd w:fill="auto" w:val="clear"/>
+              </w:rPr>
+              <w:t>Перевірка коректності передачі даних між TransferValidator та AccountLedger при спробах переказу з різними балансами, а також перевірка обробки винятків (Race Conditions, Овердрафт).</w:t>
             </w:r>
           </w:p>
         </w:tc>
@@ -1164,7 +1208,7 @@
           </w:tcPr>
           <w:p>
             <w:pPr>
-              <w:pStyle w:val="normal1"/>
+              <w:pStyle w:val="normal2"/>
               <w:pBdr/>
               <w:shd w:val="clear" w:fill="auto"/>
               <w:spacing w:lineRule="auto" w:line="300" w:before="120" w:after="120"/>
@@ -1176,11 +1220,11 @@
             </w:pPr>
             <w:r>
               <w:rPr>
-                <w:rFonts w:eastAsia="Arial" w:cs="Arial"/>
-                <w:b/>
-                <w:bCs/>
-              </w:rPr>
-              <w:t>3. Приймальне в тестування (Smoke)</w:t>
+                <w:rFonts w:eastAsia="Arial" w:cs="Arial" w:ascii="Arial" w:hAnsi="Arial"/>
+                <w:b/>
+                <w:bCs/>
+              </w:rPr>
+              <w:t>3</w:t>
             </w:r>
           </w:p>
         </w:tc>
@@ -1197,19 +1241,23 @@
           </w:tcPr>
           <w:p>
             <w:pPr>
-              <w:pStyle w:val="normal1"/>
+              <w:pStyle w:val="normal2"/>
               <w:pBdr/>
               <w:shd w:val="clear" w:fill="auto"/>
               <w:spacing w:lineRule="auto" w:line="300" w:before="120" w:after="120"/>
               <w:rPr>
                 <w:rFonts w:ascii="Arial" w:hAnsi="Arial" w:eastAsia="Arial" w:cs="Arial"/>
-              </w:rPr>
-            </w:pPr>
-            <w:r>
-              <w:rPr>
-                <w:rFonts w:eastAsia="Arial" w:cs="Arial"/>
-              </w:rPr>
-              <w:t>Швидка перевірка доступності та базової працездатності демо-середовища ParaBank перед виконанням тест-кейсів.</w:t>
+                <w:b/>
+                <w:bCs/>
+              </w:rPr>
+            </w:pPr>
+            <w:r>
+              <w:rPr>
+                <w:rFonts w:eastAsia="Arial" w:cs="Arial" w:ascii="Arial" w:hAnsi="Arial"/>
+                <w:b/>
+                <w:bCs/>
+              </w:rPr>
+              <w:t>Приймальне в тестування (Smoke Testing)</w:t>
             </w:r>
           </w:p>
         </w:tc>
@@ -1226,19 +1274,25 @@
           </w:tcPr>
           <w:p>
             <w:pPr>
-              <w:pStyle w:val="normal1"/>
+              <w:pStyle w:val="normal2"/>
               <w:pBdr/>
               <w:shd w:val="clear" w:fill="auto"/>
               <w:spacing w:lineRule="auto" w:line="300" w:before="120" w:after="120"/>
               <w:rPr>
                 <w:rFonts w:ascii="Arial" w:hAnsi="Arial" w:eastAsia="Arial" w:cs="Arial"/>
-              </w:rPr>
-            </w:pPr>
-            <w:r>
-              <w:rPr>
-                <w:rFonts w:eastAsia="Arial" w:cs="Arial"/>
-              </w:rPr>
-              <w:t>Проходження короткого чек-листа (8 перевірок): відкриття головної сторінки, вхід зареєстрованого користувача, відображення балансу, відкриття форми переказу.</w:t>
+                <w:b/>
+                <w:bCs/>
+                <w:color w:val="FF0000"/>
+              </w:rPr>
+            </w:pPr>
+            <w:r>
+              <w:rPr>
+                <w:rFonts w:eastAsia="Arial" w:cs="Arial" w:ascii="Arial" w:hAnsi="Arial"/>
+                <w:b/>
+                <w:bCs/>
+                <w:color w:val="FF0000"/>
+              </w:rPr>
+              <w:t>High</w:t>
             </w:r>
           </w:p>
         </w:tc>
@@ -1255,19 +1309,44 @@
           </w:tcPr>
           <w:p>
             <w:pPr>
-              <w:pStyle w:val="normal1"/>
+              <w:pStyle w:val="normal2"/>
               <w:pBdr/>
               <w:shd w:val="clear" w:fill="auto"/>
-              <w:spacing w:lineRule="auto" w:line="300" w:before="120" w:after="120"/>
-              <w:rPr>
-                <w:rFonts w:ascii="Arial" w:hAnsi="Arial" w:eastAsia="Arial" w:cs="Arial"/>
-              </w:rPr>
-            </w:pPr>
-            <w:r>
-              <w:rPr>
-                <w:rFonts w:eastAsia="Arial" w:cs="Arial"/>
-              </w:rPr>
-              <w:t>Марія (ТА) / Ліза (ІТ), щодня перед сесією</w:t>
+              <w:spacing w:lineRule="auto" w:line="300"/>
+              <w:rPr>
+                <w:rFonts w:ascii="Arial" w:hAnsi="Arial" w:eastAsia="Arial" w:cs="Arial"/>
+                <w:b/>
+                <w:bCs/>
+              </w:rPr>
+            </w:pPr>
+            <w:r>
+              <w:rPr>
+                <w:rFonts w:eastAsia="Arial" w:cs="Arial" w:ascii="Arial" w:hAnsi="Arial"/>
+                <w:b/>
+                <w:bCs/>
+              </w:rPr>
+              <w:t>Головні сценарії веб-кабінету</w:t>
+            </w:r>
+          </w:p>
+          <w:p>
+            <w:pPr>
+              <w:pStyle w:val="normal2"/>
+              <w:pBdr/>
+              <w:shd w:val="clear" w:fill="auto"/>
+              <w:spacing w:lineRule="auto" w:line="300" w:before="120" w:after="120"/>
+              <w:rPr>
+                <w:rFonts w:ascii="Arial" w:hAnsi="Arial" w:eastAsia="Arial" w:cs="Arial"/>
+                <w:b/>
+                <w:bCs/>
+              </w:rPr>
+            </w:pPr>
+            <w:r>
+              <w:rPr>
+                <w:rFonts w:eastAsia="Arial" w:cs="Arial" w:ascii="Arial" w:hAnsi="Arial"/>
+                <w:b/>
+                <w:bCs/>
+              </w:rPr>
+              <w:t>(Selenium IDE / Manual)</w:t>
             </w:r>
           </w:p>
         </w:tc>
@@ -1284,19 +1363,23 @@
           </w:tcPr>
           <w:p>
             <w:pPr>
-              <w:pStyle w:val="normal1"/>
+              <w:pStyle w:val="normal2"/>
               <w:pBdr/>
               <w:shd w:val="clear" w:fill="auto"/>
               <w:spacing w:lineRule="auto" w:line="300" w:before="120" w:after="120"/>
               <w:rPr>
                 <w:rFonts w:ascii="Arial" w:hAnsi="Arial" w:eastAsia="Arial" w:cs="Arial"/>
-              </w:rPr>
-            </w:pPr>
-            <w:r>
-              <w:rPr>
-                <w:rFonts w:eastAsia="Arial" w:cs="Arial"/>
-              </w:rPr>
-              <w:t>Google Chrome, Selenium IDE / Ручний чек-лист</w:t>
+                <w:b/>
+                <w:bCs/>
+              </w:rPr>
+            </w:pPr>
+            <w:r>
+              <w:rPr>
+                <w:rFonts w:eastAsia="Arial" w:cs="Arial" w:ascii="Arial" w:hAnsi="Arial"/>
+                <w:b/>
+                <w:bCs/>
+              </w:rPr>
+              <w:t>Швидка перевірка основних функцій після кожного розгортання збірки на ParaBank: успішний логін, перевірка відображення балансу, виконання переказу 123.45 грн та вихід із системи.</w:t>
             </w:r>
           </w:p>
         </w:tc>
@@ -1316,7 +1399,7 @@
           </w:tcPr>
           <w:p>
             <w:pPr>
-              <w:pStyle w:val="normal1"/>
+              <w:pStyle w:val="normal2"/>
               <w:pBdr/>
               <w:shd w:val="clear" w:fill="auto"/>
               <w:spacing w:lineRule="auto" w:line="300" w:before="120" w:after="120"/>
@@ -1329,12 +1412,12 @@
             </w:pPr>
             <w:r>
               <w:rPr>
-                <w:rFonts w:eastAsia="Arial" w:cs="Arial"/>
-                <w:b/>
-                <w:bCs/>
-                <w:shd w:fill="auto" w:val="clear"/>
-              </w:rPr>
-              <w:t>4. Системне (System)</w:t>
+                <w:rFonts w:eastAsia="Arial" w:cs="Arial" w:ascii="Arial" w:hAnsi="Arial"/>
+                <w:b/>
+                <w:bCs/>
+                <w:shd w:fill="auto" w:val="clear"/>
+              </w:rPr>
+              <w:t>4</w:t>
             </w:r>
           </w:p>
         </w:tc>
@@ -1351,21 +1434,25 @@
           </w:tcPr>
           <w:p>
             <w:pPr>
-              <w:pStyle w:val="normal1"/>
+              <w:pStyle w:val="normal2"/>
               <w:pBdr/>
               <w:shd w:val="clear" w:fill="auto"/>
               <w:spacing w:lineRule="auto" w:line="300" w:before="120" w:after="120"/>
               <w:rPr>
                 <w:rFonts w:ascii="Arial" w:hAnsi="Arial" w:eastAsia="Arial" w:cs="Arial"/>
-                <w:shd w:fill="auto" w:val="clear"/>
-              </w:rPr>
-            </w:pPr>
-            <w:r>
-              <w:rPr>
-                <w:rFonts w:eastAsia="Arial" w:cs="Arial"/>
-                <w:shd w:fill="auto" w:val="clear"/>
-              </w:rPr>
-              <w:t>Повне комплексування та перевірка відповідності кабінету банкінгу всім вимогам SRS 1.1 через веб-інтерфейс.</w:t>
+                <w:b/>
+                <w:bCs/>
+                <w:shd w:fill="auto" w:val="clear"/>
+              </w:rPr>
+            </w:pPr>
+            <w:r>
+              <w:rPr>
+                <w:rFonts w:eastAsia="Arial" w:cs="Arial" w:ascii="Arial" w:hAnsi="Arial"/>
+                <w:b/>
+                <w:bCs/>
+                <w:shd w:fill="auto" w:val="clear"/>
+              </w:rPr>
+              <w:t>Системне тестування (System Testing)</w:t>
             </w:r>
           </w:p>
         </w:tc>
@@ -1382,21 +1469,27 @@
           </w:tcPr>
           <w:p>
             <w:pPr>
-              <w:pStyle w:val="normal1"/>
+              <w:pStyle w:val="normal2"/>
               <w:pBdr/>
               <w:shd w:val="clear" w:fill="auto"/>
               <w:spacing w:lineRule="auto" w:line="300" w:before="120" w:after="120"/>
               <w:rPr>
                 <w:rFonts w:ascii="Arial" w:hAnsi="Arial" w:eastAsia="Arial" w:cs="Arial"/>
-                <w:shd w:fill="auto" w:val="clear"/>
-              </w:rPr>
-            </w:pPr>
-            <w:r>
-              <w:rPr>
-                <w:rFonts w:eastAsia="Arial" w:cs="Arial"/>
-                <w:shd w:fill="auto" w:val="clear"/>
-              </w:rPr>
-              <w:t>Виконання розроблених тест-кейсів (TC-01..TC-50): наскрізні сценарії реєстрації, переказу, відкриття рахунків, оплати та подання кредитної заявки.</w:t>
+                <w:b/>
+                <w:bCs/>
+                <w:color w:val="FF0000"/>
+                <w:shd w:fill="auto" w:val="clear"/>
+              </w:rPr>
+            </w:pPr>
+            <w:r>
+              <w:rPr>
+                <w:rFonts w:eastAsia="Arial" w:cs="Arial" w:ascii="Arial" w:hAnsi="Arial"/>
+                <w:b/>
+                <w:bCs/>
+                <w:color w:val="FF0000"/>
+                <w:shd w:fill="auto" w:val="clear"/>
+              </w:rPr>
+              <w:t>High</w:t>
             </w:r>
           </w:p>
         </w:tc>
@@ -1413,21 +1506,48 @@
           </w:tcPr>
           <w:p>
             <w:pPr>
-              <w:pStyle w:val="normal1"/>
+              <w:pStyle w:val="normal2"/>
               <w:pBdr/>
               <w:shd w:val="clear" w:fill="auto"/>
-              <w:spacing w:lineRule="auto" w:line="300" w:before="120" w:after="120"/>
-              <w:rPr>
-                <w:rFonts w:ascii="Arial" w:hAnsi="Arial" w:eastAsia="Arial" w:cs="Arial"/>
-                <w:shd w:fill="auto" w:val="clear"/>
-              </w:rPr>
-            </w:pPr>
-            <w:r>
-              <w:rPr>
-                <w:rFonts w:eastAsia="Arial" w:cs="Arial"/>
-                <w:shd w:fill="auto" w:val="clear"/>
-              </w:rPr>
-              <w:t>Уся команда, Спринти 3 та 5</w:t>
+              <w:spacing w:lineRule="auto" w:line="300"/>
+              <w:rPr>
+                <w:rFonts w:ascii="Arial" w:hAnsi="Arial" w:eastAsia="Arial" w:cs="Arial"/>
+                <w:b/>
+                <w:bCs/>
+                <w:shd w:fill="auto" w:val="clear"/>
+              </w:rPr>
+            </w:pPr>
+            <w:r>
+              <w:rPr>
+                <w:rFonts w:eastAsia="Arial" w:cs="Arial" w:ascii="Arial" w:hAnsi="Arial"/>
+                <w:b/>
+                <w:bCs/>
+                <w:shd w:fill="auto" w:val="clear"/>
+              </w:rPr>
+              <w:t>Весь веб-кабінет та REST API</w:t>
+            </w:r>
+          </w:p>
+          <w:p>
+            <w:pPr>
+              <w:pStyle w:val="normal2"/>
+              <w:pBdr/>
+              <w:shd w:val="clear" w:fill="auto"/>
+              <w:spacing w:lineRule="auto" w:line="300" w:before="120" w:after="120"/>
+              <w:rPr>
+                <w:rFonts w:ascii="Arial" w:hAnsi="Arial" w:eastAsia="Arial" w:cs="Arial"/>
+                <w:b/>
+                <w:bCs/>
+                <w:shd w:fill="auto" w:val="clear"/>
+              </w:rPr>
+            </w:pPr>
+            <w:r>
+              <w:rPr>
+                <w:rFonts w:eastAsia="Arial" w:cs="Arial" w:ascii="Arial" w:hAnsi="Arial"/>
+                <w:b/>
+                <w:bCs/>
+                <w:shd w:fill="auto" w:val="clear"/>
+              </w:rPr>
+              <w:t>(Postman, Selenium, Manual)</w:t>
             </w:r>
           </w:p>
         </w:tc>
@@ -1444,21 +1564,25 @@
           </w:tcPr>
           <w:p>
             <w:pPr>
-              <w:pStyle w:val="normal1"/>
+              <w:pStyle w:val="normal2"/>
               <w:pBdr/>
               <w:shd w:val="clear" w:fill="auto"/>
               <w:spacing w:lineRule="auto" w:line="300" w:before="120" w:after="120"/>
               <w:rPr>
                 <w:rFonts w:ascii="Arial" w:hAnsi="Arial" w:eastAsia="Arial" w:cs="Arial"/>
-                <w:shd w:fill="auto" w:val="clear"/>
-              </w:rPr>
-            </w:pPr>
-            <w:r>
-              <w:rPr>
-                <w:rFonts w:eastAsia="Arial" w:cs="Arial"/>
-                <w:shd w:fill="auto" w:val="clear"/>
-              </w:rPr>
-              <w:t>Chrome, Firefox, ParaBank Demo, TestRail / Sheets</w:t>
+                <w:b/>
+                <w:bCs/>
+                <w:shd w:fill="auto" w:val="clear"/>
+              </w:rPr>
+            </w:pPr>
+            <w:r>
+              <w:rPr>
+                <w:rFonts w:eastAsia="Arial" w:cs="Arial" w:ascii="Arial" w:hAnsi="Arial"/>
+                <w:b/>
+                <w:bCs/>
+                <w:shd w:fill="auto" w:val="clear"/>
+              </w:rPr>
+              <w:t>Комплексне проведення тестування відповідно до вимог SRS 1.1 (F-10...F-130, GUI-10...80, S-10...20): повний цикл реєстрації, відновлення доступу за 7 полями, онлайн-кредитування.</w:t>
             </w:r>
           </w:p>
         </w:tc>
@@ -1478,7 +1602,7 @@
           </w:tcPr>
           <w:p>
             <w:pPr>
-              <w:pStyle w:val="normal1"/>
+              <w:pStyle w:val="normal2"/>
               <w:pBdr/>
               <w:shd w:val="clear" w:fill="auto"/>
               <w:spacing w:lineRule="auto" w:line="300" w:before="120" w:after="120"/>
@@ -1490,11 +1614,11 @@
             </w:pPr>
             <w:r>
               <w:rPr>
-                <w:rFonts w:eastAsia="Arial" w:cs="Arial"/>
-                <w:b/>
-                <w:bCs/>
-              </w:rPr>
-              <w:t>5. Альфа-тестування (Alpha)</w:t>
+                <w:rFonts w:eastAsia="Arial" w:cs="Arial" w:ascii="Arial" w:hAnsi="Arial"/>
+                <w:b/>
+                <w:bCs/>
+              </w:rPr>
+              <w:t>5</w:t>
             </w:r>
           </w:p>
         </w:tc>
@@ -1511,19 +1635,23 @@
           </w:tcPr>
           <w:p>
             <w:pPr>
-              <w:pStyle w:val="normal1"/>
+              <w:pStyle w:val="normal2"/>
               <w:pBdr/>
               <w:shd w:val="clear" w:fill="auto"/>
               <w:spacing w:lineRule="auto" w:line="300" w:before="120" w:after="120"/>
               <w:rPr>
                 <w:rFonts w:ascii="Arial" w:hAnsi="Arial" w:eastAsia="Arial" w:cs="Arial"/>
-              </w:rPr>
-            </w:pPr>
-            <w:r>
-              <w:rPr>
-                <w:rFonts w:eastAsia="Arial" w:cs="Arial"/>
-              </w:rPr>
-              <w:t>Перевірка системи внутрішніми працівниками банку (операціоністами, фокус-групою) в умовах, наближених до реальних.</w:t>
+                <w:b/>
+                <w:bCs/>
+              </w:rPr>
+            </w:pPr>
+            <w:r>
+              <w:rPr>
+                <w:rFonts w:eastAsia="Arial" w:cs="Arial" w:ascii="Arial" w:hAnsi="Arial"/>
+                <w:b/>
+                <w:bCs/>
+              </w:rPr>
+              <w:t>Альфа-тестування (Alpha Testing)</w:t>
             </w:r>
           </w:p>
         </w:tc>
@@ -1540,19 +1668,25 @@
           </w:tcPr>
           <w:p>
             <w:pPr>
-              <w:pStyle w:val="normal1"/>
+              <w:pStyle w:val="normal2"/>
               <w:pBdr/>
               <w:shd w:val="clear" w:fill="auto"/>
               <w:spacing w:lineRule="auto" w:line="300" w:before="120" w:after="120"/>
               <w:rPr>
                 <w:rFonts w:ascii="Arial" w:hAnsi="Arial" w:eastAsia="Arial" w:cs="Arial"/>
-              </w:rPr>
-            </w:pPr>
-            <w:r>
-              <w:rPr>
-                <w:rFonts w:eastAsia="Arial" w:cs="Arial"/>
-              </w:rPr>
-              <w:t>Внутрішнє тестування реальних банківських сценаріїв (відкриття 5 рахунків поспіль, виписки за рік, денні ліміти) на внутрішньому тестовому стенді.</w:t>
+                <w:b/>
+                <w:bCs/>
+                <w:color w:val="FFA500"/>
+              </w:rPr>
+            </w:pPr>
+            <w:r>
+              <w:rPr>
+                <w:rFonts w:eastAsia="Arial" w:cs="Arial" w:ascii="Arial" w:hAnsi="Arial"/>
+                <w:b/>
+                <w:bCs/>
+                <w:color w:val="FFA500"/>
+              </w:rPr>
+              <w:t>Medium</w:t>
             </w:r>
           </w:p>
         </w:tc>
@@ -1569,19 +1703,44 @@
           </w:tcPr>
           <w:p>
             <w:pPr>
-              <w:pStyle w:val="normal1"/>
+              <w:pStyle w:val="normal2"/>
               <w:pBdr/>
               <w:shd w:val="clear" w:fill="auto"/>
-              <w:spacing w:lineRule="auto" w:line="300" w:before="120" w:after="120"/>
-              <w:rPr>
-                <w:rFonts w:ascii="Arial" w:hAnsi="Arial" w:eastAsia="Arial" w:cs="Arial"/>
-              </w:rPr>
-            </w:pPr>
-            <w:r>
-              <w:rPr>
-                <w:rFonts w:eastAsia="Arial" w:cs="Arial"/>
-              </w:rPr>
-              <w:t>Внутрішні тестувальники та банківські аналітики, Т-11</w:t>
+              <w:spacing w:lineRule="auto" w:line="300"/>
+              <w:rPr>
+                <w:rFonts w:ascii="Arial" w:hAnsi="Arial" w:eastAsia="Arial" w:cs="Arial"/>
+                <w:b/>
+                <w:bCs/>
+              </w:rPr>
+            </w:pPr>
+            <w:r>
+              <w:rPr>
+                <w:rFonts w:eastAsia="Arial" w:cs="Arial" w:ascii="Arial" w:hAnsi="Arial"/>
+                <w:b/>
+                <w:bCs/>
+              </w:rPr>
+              <w:t>Паралельна QA-команда</w:t>
+            </w:r>
+          </w:p>
+          <w:p>
+            <w:pPr>
+              <w:pStyle w:val="normal2"/>
+              <w:pBdr/>
+              <w:shd w:val="clear" w:fill="auto"/>
+              <w:spacing w:lineRule="auto" w:line="300" w:before="120" w:after="120"/>
+              <w:rPr>
+                <w:rFonts w:ascii="Arial" w:hAnsi="Arial" w:eastAsia="Arial" w:cs="Arial"/>
+                <w:b/>
+                <w:bCs/>
+              </w:rPr>
+            </w:pPr>
+            <w:r>
+              <w:rPr>
+                <w:rFonts w:eastAsia="Arial" w:cs="Arial" w:ascii="Arial" w:hAnsi="Arial"/>
+                <w:b/>
+                <w:bCs/>
+              </w:rPr>
+              <w:t>(Manual, Bug Tracker)</w:t>
             </w:r>
           </w:p>
         </w:tc>
@@ -1598,19 +1757,23 @@
           </w:tcPr>
           <w:p>
             <w:pPr>
-              <w:pStyle w:val="normal1"/>
+              <w:pStyle w:val="normal2"/>
               <w:pBdr/>
               <w:shd w:val="clear" w:fill="auto"/>
               <w:spacing w:lineRule="auto" w:line="300" w:before="120" w:after="120"/>
               <w:rPr>
                 <w:rFonts w:ascii="Arial" w:hAnsi="Arial" w:eastAsia="Arial" w:cs="Arial"/>
-              </w:rPr>
-            </w:pPr>
-            <w:r>
-              <w:rPr>
-                <w:rFonts w:eastAsia="Arial" w:cs="Arial"/>
-              </w:rPr>
-              <w:t>Внутрішній Staging-сервер, тестові БД PostgreSQL</w:t>
+                <w:b/>
+                <w:bCs/>
+              </w:rPr>
+            </w:pPr>
+            <w:r>
+              <w:rPr>
+                <w:rFonts w:eastAsia="Arial" w:cs="Arial" w:ascii="Arial" w:hAnsi="Arial"/>
+                <w:b/>
+                <w:bCs/>
+              </w:rPr>
+              <w:t>Виконується членами суміжної студентської QA-команди під рольовими акаунтами («Клієнт», «Адміністратор») у тестовому середовищі ParaBank Demo для виявлення прихованих дефектів.</w:t>
             </w:r>
           </w:p>
         </w:tc>
@@ -1630,7 +1793,7 @@
           </w:tcPr>
           <w:p>
             <w:pPr>
-              <w:pStyle w:val="normal1"/>
+              <w:pStyle w:val="normal2"/>
               <w:pBdr/>
               <w:shd w:val="clear" w:fill="auto"/>
               <w:spacing w:lineRule="auto" w:line="300" w:before="120" w:after="120"/>
@@ -1643,12 +1806,12 @@
             </w:pPr>
             <w:r>
               <w:rPr>
-                <w:rFonts w:eastAsia="Arial" w:cs="Arial"/>
-                <w:b/>
-                <w:bCs/>
-                <w:shd w:fill="auto" w:val="clear"/>
-              </w:rPr>
-              <w:t>6. Бета-тестування (Beta)</w:t>
+                <w:rFonts w:eastAsia="Arial" w:cs="Arial" w:ascii="Arial" w:hAnsi="Arial"/>
+                <w:b/>
+                <w:bCs/>
+                <w:shd w:fill="auto" w:val="clear"/>
+              </w:rPr>
+              <w:t>6</w:t>
             </w:r>
           </w:p>
         </w:tc>
@@ -1665,21 +1828,25 @@
           </w:tcPr>
           <w:p>
             <w:pPr>
-              <w:pStyle w:val="normal1"/>
+              <w:pStyle w:val="normal2"/>
               <w:pBdr/>
               <w:shd w:val="clear" w:fill="auto"/>
               <w:spacing w:lineRule="auto" w:line="300" w:before="120" w:after="120"/>
               <w:rPr>
                 <w:rFonts w:ascii="Arial" w:hAnsi="Arial" w:eastAsia="Arial" w:cs="Arial"/>
-                <w:shd w:fill="auto" w:val="clear"/>
-              </w:rPr>
-            </w:pPr>
-            <w:r>
-              <w:rPr>
-                <w:rFonts w:eastAsia="Arial" w:cs="Arial"/>
-                <w:shd w:fill="auto" w:val="clear"/>
-              </w:rPr>
-              <w:t>Отримання зворотного зв'язку від обмеженої групи реальних клієнтів банку (100–200 осіб) до офіційного релізу.</w:t>
+                <w:b/>
+                <w:bCs/>
+                <w:shd w:fill="auto" w:val="clear"/>
+              </w:rPr>
+            </w:pPr>
+            <w:r>
+              <w:rPr>
+                <w:rFonts w:eastAsia="Arial" w:cs="Arial" w:ascii="Arial" w:hAnsi="Arial"/>
+                <w:b/>
+                <w:bCs/>
+                <w:shd w:fill="auto" w:val="clear"/>
+              </w:rPr>
+              <w:t>Бета-тестування (Beta Testing)</w:t>
             </w:r>
           </w:p>
         </w:tc>
@@ -1696,21 +1863,27 @@
           </w:tcPr>
           <w:p>
             <w:pPr>
-              <w:pStyle w:val="normal1"/>
+              <w:pStyle w:val="normal2"/>
               <w:pBdr/>
               <w:shd w:val="clear" w:fill="auto"/>
               <w:spacing w:lineRule="auto" w:line="300" w:before="120" w:after="120"/>
               <w:rPr>
                 <w:rFonts w:ascii="Arial" w:hAnsi="Arial" w:eastAsia="Arial" w:cs="Arial"/>
-                <w:shd w:fill="auto" w:val="clear"/>
-              </w:rPr>
-            </w:pPr>
-            <w:r>
-              <w:rPr>
-                <w:rFonts w:eastAsia="Arial" w:cs="Arial"/>
-                <w:shd w:fill="auto" w:val="clear"/>
-              </w:rPr>
-              <w:t>Надання доступу фокус-групі клієнтів із можливістю відправки відгуків через форму зворотного зв'язку та моніторингом збоїв.</w:t>
+                <w:b/>
+                <w:bCs/>
+                <w:color w:val="FFA500"/>
+                <w:shd w:fill="auto" w:val="clear"/>
+              </w:rPr>
+            </w:pPr>
+            <w:r>
+              <w:rPr>
+                <w:rFonts w:eastAsia="Arial" w:cs="Arial" w:ascii="Arial" w:hAnsi="Arial"/>
+                <w:b/>
+                <w:bCs/>
+                <w:color w:val="FFA500"/>
+                <w:shd w:fill="auto" w:val="clear"/>
+              </w:rPr>
+              <w:t>Medium</w:t>
             </w:r>
           </w:p>
         </w:tc>
@@ -1727,21 +1900,48 @@
           </w:tcPr>
           <w:p>
             <w:pPr>
-              <w:pStyle w:val="normal1"/>
+              <w:pStyle w:val="normal2"/>
               <w:pBdr/>
               <w:shd w:val="clear" w:fill="auto"/>
-              <w:spacing w:lineRule="auto" w:line="300" w:before="120" w:after="120"/>
-              <w:rPr>
-                <w:rFonts w:ascii="Arial" w:hAnsi="Arial" w:eastAsia="Arial" w:cs="Arial"/>
-                <w:shd w:fill="auto" w:val="clear"/>
-              </w:rPr>
-            </w:pPr>
-            <w:r>
-              <w:rPr>
-                <w:rFonts w:eastAsia="Arial" w:cs="Arial"/>
-                <w:shd w:fill="auto" w:val="clear"/>
-              </w:rPr>
-              <w:t>Зовнішні фокус-клієнти, Т-12</w:t>
+              <w:spacing w:lineRule="auto" w:line="300"/>
+              <w:rPr>
+                <w:rFonts w:ascii="Arial" w:hAnsi="Arial" w:eastAsia="Arial" w:cs="Arial"/>
+                <w:b/>
+                <w:bCs/>
+                <w:shd w:fill="auto" w:val="clear"/>
+              </w:rPr>
+            </w:pPr>
+            <w:r>
+              <w:rPr>
+                <w:rFonts w:eastAsia="Arial" w:cs="Arial" w:ascii="Arial" w:hAnsi="Arial"/>
+                <w:b/>
+                <w:bCs/>
+                <w:shd w:fill="auto" w:val="clear"/>
+              </w:rPr>
+              <w:t>Студентська фокус-група</w:t>
+            </w:r>
+          </w:p>
+          <w:p>
+            <w:pPr>
+              <w:pStyle w:val="normal2"/>
+              <w:pBdr/>
+              <w:shd w:val="clear" w:fill="auto"/>
+              <w:spacing w:lineRule="auto" w:line="300" w:before="120" w:after="120"/>
+              <w:rPr>
+                <w:rFonts w:ascii="Arial" w:hAnsi="Arial" w:eastAsia="Arial" w:cs="Arial"/>
+                <w:b/>
+                <w:bCs/>
+                <w:shd w:fill="auto" w:val="clear"/>
+              </w:rPr>
+            </w:pPr>
+            <w:r>
+              <w:rPr>
+                <w:rFonts w:eastAsia="Arial" w:cs="Arial" w:ascii="Arial" w:hAnsi="Arial"/>
+                <w:b/>
+                <w:bCs/>
+                <w:shd w:fill="auto" w:val="clear"/>
+              </w:rPr>
+              <w:t>(Google Forms, Feedback)</w:t>
             </w:r>
           </w:p>
         </w:tc>
@@ -1758,21 +1958,25 @@
           </w:tcPr>
           <w:p>
             <w:pPr>
-              <w:pStyle w:val="normal1"/>
+              <w:pStyle w:val="normal2"/>
               <w:pBdr/>
               <w:shd w:val="clear" w:fill="auto"/>
               <w:spacing w:lineRule="auto" w:line="300" w:before="120" w:after="120"/>
               <w:rPr>
                 <w:rFonts w:ascii="Arial" w:hAnsi="Arial" w:eastAsia="Arial" w:cs="Arial"/>
-                <w:shd w:fill="auto" w:val="clear"/>
-              </w:rPr>
-            </w:pPr>
-            <w:r>
-              <w:rPr>
-                <w:rFonts w:eastAsia="Arial" w:cs="Arial"/>
-                <w:shd w:fill="auto" w:val="clear"/>
-              </w:rPr>
-              <w:t>Beta-середовище банкінгу, форма фідбеку</w:t>
+                <w:b/>
+                <w:bCs/>
+                <w:shd w:fill="auto" w:val="clear"/>
+              </w:rPr>
+            </w:pPr>
+            <w:r>
+              <w:rPr>
+                <w:rFonts w:eastAsia="Arial" w:cs="Arial" w:ascii="Arial" w:hAnsi="Arial"/>
+                <w:b/>
+                <w:bCs/>
+                <w:shd w:fill="auto" w:val="clear"/>
+              </w:rPr>
+              <w:t>Тестування студентською фокус-групою (3–5 осіб), які виконують реальні банківські операції на демо-стенді з фіксацією зручності інтерфейсу (U-10) та пропозицій.</w:t>
             </w:r>
           </w:p>
         </w:tc>
@@ -1792,7 +1996,7 @@
           </w:tcPr>
           <w:p>
             <w:pPr>
-              <w:pStyle w:val="normal1"/>
+              <w:pStyle w:val="normal2"/>
               <w:pBdr/>
               <w:shd w:val="clear" w:fill="auto"/>
               <w:spacing w:lineRule="auto" w:line="300" w:before="120" w:after="120"/>
@@ -1804,11 +2008,11 @@
             </w:pPr>
             <w:r>
               <w:rPr>
-                <w:rFonts w:eastAsia="Arial" w:cs="Arial"/>
-                <w:b/>
-                <w:bCs/>
-              </w:rPr>
-              <w:t>7. Приймальне замовником (Acceptance / UAT)</w:t>
+                <w:rFonts w:eastAsia="Arial" w:cs="Arial" w:ascii="Arial" w:hAnsi="Arial"/>
+                <w:b/>
+                <w:bCs/>
+              </w:rPr>
+              <w:t>7</w:t>
             </w:r>
           </w:p>
         </w:tc>
@@ -1825,19 +2029,23 @@
           </w:tcPr>
           <w:p>
             <w:pPr>
-              <w:pStyle w:val="normal1"/>
+              <w:pStyle w:val="normal2"/>
               <w:pBdr/>
               <w:shd w:val="clear" w:fill="auto"/>
               <w:spacing w:lineRule="auto" w:line="300" w:before="120" w:after="120"/>
               <w:rPr>
                 <w:rFonts w:ascii="Arial" w:hAnsi="Arial" w:eastAsia="Arial" w:cs="Arial"/>
-              </w:rPr>
-            </w:pPr>
-            <w:r>
-              <w:rPr>
-                <w:rFonts w:eastAsia="Arial" w:cs="Arial"/>
-              </w:rPr>
-              <w:t>Підтвердження замовником (керівництвом банку) готовності продукту до здачі в промислову експлуатацію.</w:t>
+                <w:b/>
+                <w:bCs/>
+              </w:rPr>
+            </w:pPr>
+            <w:r>
+              <w:rPr>
+                <w:rFonts w:eastAsia="Arial" w:cs="Arial" w:ascii="Arial" w:hAnsi="Arial"/>
+                <w:b/>
+                <w:bCs/>
+              </w:rPr>
+              <w:t>Приймальне тестування Замовником (UAT)</w:t>
             </w:r>
           </w:p>
         </w:tc>
@@ -1854,19 +2062,25 @@
           </w:tcPr>
           <w:p>
             <w:pPr>
-              <w:pStyle w:val="normal1"/>
+              <w:pStyle w:val="normal2"/>
               <w:pBdr/>
               <w:shd w:val="clear" w:fill="auto"/>
               <w:spacing w:lineRule="auto" w:line="300" w:before="120" w:after="120"/>
               <w:rPr>
                 <w:rFonts w:ascii="Arial" w:hAnsi="Arial" w:eastAsia="Arial" w:cs="Arial"/>
-              </w:rPr>
-            </w:pPr>
-            <w:r>
-              <w:rPr>
-                <w:rFonts w:eastAsia="Arial" w:cs="Arial"/>
-              </w:rPr>
-              <w:t>Проходження контрольного набору бізнес-сценаріїв (Acceptance Test Suite) у присутності Замовника за актом приймання.</w:t>
+                <w:b/>
+                <w:bCs/>
+                <w:color w:val="FF0000"/>
+              </w:rPr>
+            </w:pPr>
+            <w:r>
+              <w:rPr>
+                <w:rFonts w:eastAsia="Arial" w:cs="Arial" w:ascii="Arial" w:hAnsi="Arial"/>
+                <w:b/>
+                <w:bCs/>
+                <w:color w:val="FF0000"/>
+              </w:rPr>
+              <w:t>High</w:t>
             </w:r>
           </w:p>
         </w:tc>
@@ -1883,19 +2097,44 @@
           </w:tcPr>
           <w:p>
             <w:pPr>
-              <w:pStyle w:val="normal1"/>
+              <w:pStyle w:val="normal2"/>
               <w:pBdr/>
               <w:shd w:val="clear" w:fill="auto"/>
-              <w:spacing w:lineRule="auto" w:line="300" w:before="120" w:after="120"/>
-              <w:rPr>
-                <w:rFonts w:ascii="Arial" w:hAnsi="Arial" w:eastAsia="Arial" w:cs="Arial"/>
-              </w:rPr>
-            </w:pPr>
-            <w:r>
-              <w:rPr>
-                <w:rFonts w:eastAsia="Arial" w:cs="Arial"/>
-              </w:rPr>
-              <w:t>Замовник, КТ (Дарія), Тиждень 12</w:t>
+              <w:spacing w:lineRule="auto" w:line="300"/>
+              <w:rPr>
+                <w:rFonts w:ascii="Arial" w:hAnsi="Arial" w:eastAsia="Arial" w:cs="Arial"/>
+                <w:b/>
+                <w:bCs/>
+              </w:rPr>
+            </w:pPr>
+            <w:r>
+              <w:rPr>
+                <w:rFonts w:eastAsia="Arial" w:cs="Arial" w:ascii="Arial" w:hAnsi="Arial"/>
+                <w:b/>
+                <w:bCs/>
+              </w:rPr>
+              <w:t>Замовник / Викладач</w:t>
+            </w:r>
+          </w:p>
+          <w:p>
+            <w:pPr>
+              <w:pStyle w:val="normal2"/>
+              <w:pBdr/>
+              <w:shd w:val="clear" w:fill="auto"/>
+              <w:spacing w:lineRule="auto" w:line="300" w:before="120" w:after="120"/>
+              <w:rPr>
+                <w:rFonts w:ascii="Arial" w:hAnsi="Arial" w:eastAsia="Arial" w:cs="Arial"/>
+                <w:b/>
+                <w:bCs/>
+              </w:rPr>
+            </w:pPr>
+            <w:r>
+              <w:rPr>
+                <w:rFonts w:eastAsia="Arial" w:cs="Arial" w:ascii="Arial" w:hAnsi="Arial"/>
+                <w:b/>
+                <w:bCs/>
+              </w:rPr>
+              <w:t>(Checklist DoD, Demo)</w:t>
             </w:r>
           </w:p>
         </w:tc>
@@ -1912,19 +2151,23 @@
           </w:tcPr>
           <w:p>
             <w:pPr>
-              <w:pStyle w:val="normal1"/>
+              <w:pStyle w:val="normal2"/>
               <w:pBdr/>
               <w:shd w:val="clear" w:fill="auto"/>
               <w:spacing w:lineRule="auto" w:line="300" w:before="120" w:after="120"/>
               <w:rPr>
                 <w:rFonts w:ascii="Arial" w:hAnsi="Arial" w:eastAsia="Arial" w:cs="Arial"/>
-              </w:rPr>
-            </w:pPr>
-            <w:r>
-              <w:rPr>
-                <w:rFonts w:eastAsia="Arial" w:cs="Arial"/>
-              </w:rPr>
-              <w:t>Production Candidate Staging</w:t>
+                <w:b/>
+                <w:bCs/>
+              </w:rPr>
+            </w:pPr>
+            <w:r>
+              <w:rPr>
+                <w:rFonts w:eastAsia="Arial" w:cs="Arial" w:ascii="Arial" w:hAnsi="Arial"/>
+                <w:b/>
+                <w:bCs/>
+              </w:rPr>
+              <w:t>Фінальна перевірка відповідності продукту «ФінКит» специфікації SRS 1.1 та критеріям Definition of Done під час захисту на Demo-занятті.</w:t>
             </w:r>
           </w:p>
         </w:tc>
@@ -1932,19 +2175,24 @@
     </w:tbl>
     <w:p>
       <w:pPr>
+        <w:pStyle w:val="Normal"/>
+        <w:shd w:val="clear" w:fill="auto"/>
+        <w:rPr/>
+      </w:pPr>
+      <w:r>
+        <w:rPr/>
+      </w:r>
+    </w:p>
+    <w:p>
+      <w:pPr>
         <w:pStyle w:val="Heading2"/>
-        <w:pBdr/>
         <w:shd w:val="clear" w:fill="auto"/>
         <w:spacing w:lineRule="auto" w:line="240" w:before="300" w:after="225"/>
         <w:rPr/>
       </w:pPr>
       <w:r>
         <w:rPr/>
-        <w:t>4</w:t>
-      </w:r>
-      <w:r>
-        <w:rPr/>
-        <w:t>. Характеристика типів тестування (13 застосовних та 2 незастосовні)</w:t>
+        <w:t>4. Характеристика типів тестування (13 застосовних та 2 незастосовні)</w:t>
       </w:r>
     </w:p>
     <w:tbl>
@@ -1988,7 +2236,6 @@
           <w:p>
             <w:pPr>
               <w:pStyle w:val="normal1"/>
-              <w:pBdr/>
               <w:shd w:val="clear" w:fill="auto"/>
               <w:spacing w:lineRule="auto" w:line="300" w:before="120" w:after="120"/>
               <w:rPr>
@@ -2019,7 +2266,6 @@
           <w:p>
             <w:pPr>
               <w:pStyle w:val="normal1"/>
-              <w:pBdr/>
               <w:shd w:val="clear" w:fill="auto"/>
               <w:spacing w:lineRule="auto" w:line="300" w:before="120" w:after="120"/>
               <w:rPr>
@@ -2050,7 +2296,6 @@
           <w:p>
             <w:pPr>
               <w:pStyle w:val="normal1"/>
-              <w:pBdr/>
               <w:shd w:val="clear" w:fill="auto"/>
               <w:spacing w:lineRule="auto" w:line="300" w:before="120" w:after="120"/>
               <w:rPr>
@@ -2081,7 +2326,6 @@
           <w:p>
             <w:pPr>
               <w:pStyle w:val="normal1"/>
-              <w:pBdr/>
               <w:shd w:val="clear" w:fill="auto"/>
               <w:spacing w:lineRule="auto" w:line="300" w:before="120" w:after="120"/>
               <w:rPr>
@@ -2112,7 +2356,6 @@
           <w:p>
             <w:pPr>
               <w:pStyle w:val="normal1"/>
-              <w:pBdr/>
               <w:shd w:val="clear" w:fill="auto"/>
               <w:spacing w:lineRule="auto" w:line="300" w:before="120" w:after="120"/>
               <w:rPr>
@@ -2143,7 +2386,6 @@
           <w:p>
             <w:pPr>
               <w:pStyle w:val="normal1"/>
-              <w:pBdr/>
               <w:shd w:val="clear" w:fill="auto"/>
               <w:spacing w:lineRule="auto" w:line="300" w:before="120" w:after="120"/>
               <w:rPr>
@@ -2165,7 +2407,6 @@
               <w:keepNext w:val="false"/>
               <w:keepLines w:val="false"/>
               <w:widowControl w:val="false"/>
-              <w:pBdr/>
               <w:shd w:val="clear" w:fill="auto"/>
               <w:spacing w:lineRule="auto" w:line="240" w:before="0" w:after="0"/>
               <w:ind w:hanging="0" w:start="0" w:end="0"/>
@@ -2199,7 +2440,6 @@
           <w:p>
             <w:pPr>
               <w:pStyle w:val="normal1"/>
-              <w:pBdr/>
               <w:shd w:val="clear" w:fill="auto"/>
               <w:spacing w:lineRule="auto" w:line="300" w:before="120" w:after="120"/>
               <w:rPr>
@@ -2232,7 +2472,6 @@
           <w:p>
             <w:pPr>
               <w:pStyle w:val="normal1"/>
-              <w:pBdr/>
               <w:shd w:val="clear" w:fill="auto"/>
               <w:spacing w:lineRule="auto" w:line="300" w:before="120" w:after="120"/>
               <w:rPr>
@@ -2261,7 +2500,6 @@
           <w:p>
             <w:pPr>
               <w:pStyle w:val="normal1"/>
-              <w:pBdr/>
               <w:shd w:val="clear" w:fill="auto"/>
               <w:spacing w:lineRule="auto" w:line="300" w:before="120" w:after="120"/>
               <w:rPr>
@@ -2290,7 +2528,6 @@
           <w:p>
             <w:pPr>
               <w:pStyle w:val="normal1"/>
-              <w:pBdr/>
               <w:shd w:val="clear" w:fill="auto"/>
               <w:spacing w:lineRule="auto" w:line="300" w:before="120" w:after="120"/>
               <w:rPr>
@@ -2319,7 +2556,6 @@
           <w:p>
             <w:pPr>
               <w:pStyle w:val="normal1"/>
-              <w:pBdr/>
               <w:shd w:val="clear" w:fill="auto"/>
               <w:spacing w:lineRule="auto" w:line="300" w:before="120" w:after="120"/>
               <w:rPr>
@@ -2348,7 +2584,6 @@
           <w:p>
             <w:pPr>
               <w:pStyle w:val="normal1"/>
-              <w:pBdr/>
               <w:shd w:val="clear" w:fill="auto"/>
               <w:spacing w:lineRule="auto" w:line="300" w:before="120" w:after="120"/>
               <w:rPr>
@@ -2380,7 +2615,6 @@
           <w:p>
             <w:pPr>
               <w:pStyle w:val="normal1"/>
-              <w:pBdr/>
               <w:shd w:val="clear" w:fill="auto"/>
               <w:spacing w:lineRule="auto" w:line="300" w:before="120" w:after="120"/>
               <w:rPr>
@@ -2415,7 +2649,6 @@
           <w:p>
             <w:pPr>
               <w:pStyle w:val="normal1"/>
-              <w:pBdr/>
               <w:shd w:val="clear" w:fill="auto"/>
               <w:spacing w:lineRule="auto" w:line="300" w:before="120" w:after="120"/>
               <w:rPr>
@@ -2446,7 +2679,6 @@
           <w:p>
             <w:pPr>
               <w:pStyle w:val="normal1"/>
-              <w:pBdr/>
               <w:shd w:val="clear" w:fill="auto"/>
               <w:spacing w:lineRule="auto" w:line="300" w:before="120" w:after="120"/>
               <w:rPr>
@@ -2477,7 +2709,6 @@
           <w:p>
             <w:pPr>
               <w:pStyle w:val="normal1"/>
-              <w:pBdr/>
               <w:shd w:val="clear" w:fill="auto"/>
               <w:spacing w:lineRule="auto" w:line="300" w:before="120" w:after="120"/>
               <w:rPr>
@@ -2508,7 +2739,6 @@
           <w:p>
             <w:pPr>
               <w:pStyle w:val="normal1"/>
-              <w:pBdr/>
               <w:shd w:val="clear" w:fill="auto"/>
               <w:spacing w:lineRule="auto" w:line="300" w:before="120" w:after="120"/>
               <w:rPr>
@@ -2539,7 +2769,6 @@
           <w:p>
             <w:pPr>
               <w:pStyle w:val="normal1"/>
-              <w:pBdr/>
               <w:shd w:val="clear" w:fill="auto"/>
               <w:spacing w:lineRule="auto" w:line="300" w:before="120" w:after="120"/>
               <w:rPr>
@@ -2573,7 +2802,6 @@
           <w:p>
             <w:pPr>
               <w:pStyle w:val="normal1"/>
-              <w:pBdr/>
               <w:shd w:val="clear" w:fill="auto"/>
               <w:spacing w:lineRule="auto" w:line="300" w:before="120" w:after="120"/>
               <w:rPr>
@@ -2606,7 +2834,6 @@
           <w:p>
             <w:pPr>
               <w:pStyle w:val="normal1"/>
-              <w:pBdr/>
               <w:shd w:val="clear" w:fill="auto"/>
               <w:spacing w:lineRule="auto" w:line="300" w:before="120" w:after="120"/>
               <w:rPr>
@@ -2635,7 +2862,6 @@
           <w:p>
             <w:pPr>
               <w:pStyle w:val="normal1"/>
-              <w:pBdr/>
               <w:shd w:val="clear" w:fill="auto"/>
               <w:spacing w:lineRule="auto" w:line="300" w:before="120" w:after="120"/>
               <w:rPr>
@@ -2664,7 +2890,6 @@
           <w:p>
             <w:pPr>
               <w:pStyle w:val="normal1"/>
-              <w:pBdr/>
               <w:shd w:val="clear" w:fill="auto"/>
               <w:spacing w:lineRule="auto" w:line="300" w:before="120" w:after="120"/>
               <w:rPr>
@@ -2693,7 +2918,6 @@
           <w:p>
             <w:pPr>
               <w:pStyle w:val="normal1"/>
-              <w:pBdr/>
               <w:shd w:val="clear" w:fill="auto"/>
               <w:spacing w:lineRule="auto" w:line="300" w:before="120" w:after="120"/>
               <w:rPr>
@@ -2722,7 +2946,6 @@
           <w:p>
             <w:pPr>
               <w:pStyle w:val="normal1"/>
-              <w:pBdr/>
               <w:shd w:val="clear" w:fill="auto"/>
               <w:spacing w:lineRule="auto" w:line="300" w:before="120" w:after="120"/>
               <w:rPr>
@@ -2754,7 +2977,6 @@
           <w:p>
             <w:pPr>
               <w:pStyle w:val="normal1"/>
-              <w:pBdr/>
               <w:shd w:val="clear" w:fill="auto"/>
               <w:spacing w:lineRule="auto" w:line="300" w:before="120" w:after="120"/>
               <w:rPr>
@@ -2789,7 +3011,6 @@
           <w:p>
             <w:pPr>
               <w:pStyle w:val="normal1"/>
-              <w:pBdr/>
               <w:shd w:val="clear" w:fill="auto"/>
               <w:spacing w:lineRule="auto" w:line="300" w:before="120" w:after="120"/>
               <w:rPr>
@@ -2820,7 +3041,6 @@
           <w:p>
             <w:pPr>
               <w:pStyle w:val="normal1"/>
-              <w:pBdr/>
               <w:shd w:val="clear" w:fill="auto"/>
               <w:spacing w:lineRule="auto" w:line="300" w:before="120" w:after="120"/>
               <w:rPr>
@@ -2851,7 +3071,6 @@
           <w:p>
             <w:pPr>
               <w:pStyle w:val="normal1"/>
-              <w:pBdr/>
               <w:shd w:val="clear" w:fill="auto"/>
               <w:spacing w:lineRule="auto" w:line="300" w:before="120" w:after="120"/>
               <w:rPr>
@@ -2882,7 +3101,6 @@
           <w:p>
             <w:pPr>
               <w:pStyle w:val="normal1"/>
-              <w:pBdr/>
               <w:shd w:val="clear" w:fill="auto"/>
               <w:spacing w:lineRule="auto" w:line="300" w:before="120" w:after="120"/>
               <w:rPr>
@@ -2913,7 +3131,6 @@
           <w:p>
             <w:pPr>
               <w:pStyle w:val="normal1"/>
-              <w:pBdr/>
               <w:shd w:val="clear" w:fill="auto"/>
               <w:spacing w:lineRule="auto" w:line="300" w:before="120" w:after="120"/>
               <w:rPr>
@@ -2947,7 +3164,6 @@
           <w:p>
             <w:pPr>
               <w:pStyle w:val="normal1"/>
-              <w:pBdr/>
               <w:shd w:val="clear" w:fill="auto"/>
               <w:spacing w:lineRule="auto" w:line="300" w:before="120" w:after="120"/>
               <w:rPr>
@@ -2980,7 +3196,6 @@
           <w:p>
             <w:pPr>
               <w:pStyle w:val="normal1"/>
-              <w:pBdr/>
               <w:shd w:val="clear" w:fill="auto"/>
               <w:spacing w:lineRule="auto" w:line="300" w:before="120" w:after="120"/>
               <w:rPr>
@@ -3009,7 +3224,6 @@
           <w:p>
             <w:pPr>
               <w:pStyle w:val="normal1"/>
-              <w:pBdr/>
               <w:shd w:val="clear" w:fill="auto"/>
               <w:spacing w:lineRule="auto" w:line="300" w:before="120" w:after="120"/>
               <w:rPr>
@@ -3038,7 +3252,6 @@
           <w:p>
             <w:pPr>
               <w:pStyle w:val="normal1"/>
-              <w:pBdr/>
               <w:shd w:val="clear" w:fill="auto"/>
               <w:spacing w:lineRule="auto" w:line="300" w:before="120" w:after="120"/>
               <w:rPr>
@@ -3067,7 +3280,6 @@
           <w:p>
             <w:pPr>
               <w:pStyle w:val="normal1"/>
-              <w:pBdr/>
               <w:shd w:val="clear" w:fill="auto"/>
               <w:spacing w:lineRule="auto" w:line="300" w:before="120" w:after="120"/>
               <w:rPr>
@@ -3096,7 +3308,6 @@
           <w:p>
             <w:pPr>
               <w:pStyle w:val="normal1"/>
-              <w:pBdr/>
               <w:shd w:val="clear" w:fill="auto"/>
               <w:spacing w:lineRule="auto" w:line="300" w:before="120" w:after="120"/>
               <w:rPr>
@@ -3128,7 +3339,6 @@
           <w:p>
             <w:pPr>
               <w:pStyle w:val="normal1"/>
-              <w:pBdr/>
               <w:shd w:val="clear" w:fill="auto"/>
               <w:spacing w:lineRule="auto" w:line="300" w:before="120" w:after="120"/>
               <w:rPr>
@@ -3163,7 +3373,6 @@
           <w:p>
             <w:pPr>
               <w:pStyle w:val="normal1"/>
-              <w:pBdr/>
               <w:shd w:val="clear" w:fill="auto"/>
               <w:spacing w:lineRule="auto" w:line="300" w:before="120" w:after="120"/>
               <w:rPr>
@@ -3194,7 +3403,6 @@
           <w:p>
             <w:pPr>
               <w:pStyle w:val="normal1"/>
-              <w:pBdr/>
               <w:shd w:val="clear" w:fill="auto"/>
               <w:spacing w:lineRule="auto" w:line="300" w:before="120" w:after="120"/>
               <w:rPr>
@@ -3225,7 +3433,6 @@
           <w:p>
             <w:pPr>
               <w:pStyle w:val="normal1"/>
-              <w:pBdr/>
               <w:shd w:val="clear" w:fill="auto"/>
               <w:spacing w:lineRule="auto" w:line="300" w:before="120" w:after="120"/>
               <w:rPr>
@@ -3256,7 +3463,6 @@
           <w:p>
             <w:pPr>
               <w:pStyle w:val="normal1"/>
-              <w:pBdr/>
               <w:shd w:val="clear" w:fill="auto"/>
               <w:spacing w:lineRule="auto" w:line="300" w:before="120" w:after="120"/>
               <w:rPr>
@@ -3287,7 +3493,6 @@
           <w:p>
             <w:pPr>
               <w:pStyle w:val="normal1"/>
-              <w:pBdr/>
               <w:shd w:val="clear" w:fill="auto"/>
               <w:spacing w:lineRule="auto" w:line="300" w:before="120" w:after="120"/>
               <w:rPr>
@@ -3321,7 +3526,6 @@
           <w:p>
             <w:pPr>
               <w:pStyle w:val="normal1"/>
-              <w:pBdr/>
               <w:shd w:val="clear" w:fill="auto"/>
               <w:spacing w:lineRule="auto" w:line="300" w:before="120" w:after="120"/>
               <w:rPr>
@@ -3354,7 +3558,6 @@
           <w:p>
             <w:pPr>
               <w:pStyle w:val="normal1"/>
-              <w:pBdr/>
               <w:shd w:val="clear" w:fill="auto"/>
               <w:spacing w:lineRule="auto" w:line="300" w:before="120" w:after="120"/>
               <w:rPr>
@@ -3383,7 +3586,6 @@
           <w:p>
             <w:pPr>
               <w:pStyle w:val="normal1"/>
-              <w:pBdr/>
               <w:shd w:val="clear" w:fill="auto"/>
               <w:spacing w:lineRule="auto" w:line="300" w:before="120" w:after="120"/>
               <w:rPr>
@@ -3412,7 +3614,6 @@
           <w:p>
             <w:pPr>
               <w:pStyle w:val="normal1"/>
-              <w:pBdr/>
               <w:shd w:val="clear" w:fill="auto"/>
               <w:spacing w:lineRule="auto" w:line="300" w:before="120" w:after="120"/>
               <w:rPr>
@@ -3441,7 +3642,6 @@
           <w:p>
             <w:pPr>
               <w:pStyle w:val="normal1"/>
-              <w:pBdr/>
               <w:shd w:val="clear" w:fill="auto"/>
               <w:spacing w:lineRule="auto" w:line="300" w:before="120" w:after="120"/>
               <w:rPr>
@@ -3470,7 +3670,6 @@
           <w:p>
             <w:pPr>
               <w:pStyle w:val="normal1"/>
-              <w:pBdr/>
               <w:shd w:val="clear" w:fill="auto"/>
               <w:spacing w:lineRule="auto" w:line="300" w:before="120" w:after="120"/>
               <w:rPr>
@@ -3502,7 +3701,6 @@
           <w:p>
             <w:pPr>
               <w:pStyle w:val="normal1"/>
-              <w:pBdr/>
               <w:shd w:val="clear" w:fill="auto"/>
               <w:spacing w:lineRule="auto" w:line="300" w:before="120" w:after="120"/>
               <w:rPr>
@@ -3537,7 +3735,6 @@
           <w:p>
             <w:pPr>
               <w:pStyle w:val="normal1"/>
-              <w:pBdr/>
               <w:shd w:val="clear" w:fill="auto"/>
               <w:spacing w:lineRule="auto" w:line="300" w:before="120" w:after="120"/>
               <w:rPr>
@@ -3568,7 +3765,6 @@
           <w:p>
             <w:pPr>
               <w:pStyle w:val="normal1"/>
-              <w:pBdr/>
               <w:shd w:val="clear" w:fill="auto"/>
               <w:spacing w:lineRule="auto" w:line="300" w:before="120" w:after="120"/>
               <w:rPr>
@@ -3599,7 +3795,6 @@
           <w:p>
             <w:pPr>
               <w:pStyle w:val="normal1"/>
-              <w:pBdr/>
               <w:shd w:val="clear" w:fill="auto"/>
               <w:spacing w:lineRule="auto" w:line="300" w:before="120" w:after="120"/>
               <w:rPr>
@@ -3630,7 +3825,6 @@
           <w:p>
             <w:pPr>
               <w:pStyle w:val="normal1"/>
-              <w:pBdr/>
               <w:shd w:val="clear" w:fill="auto"/>
               <w:spacing w:lineRule="auto" w:line="300" w:before="120" w:after="120"/>
               <w:rPr>
@@ -3661,7 +3855,6 @@
           <w:p>
             <w:pPr>
               <w:pStyle w:val="normal1"/>
-              <w:pBdr/>
               <w:shd w:val="clear" w:fill="auto"/>
               <w:spacing w:lineRule="auto" w:line="300" w:before="120" w:after="120"/>
               <w:rPr>
@@ -3695,7 +3888,6 @@
           <w:p>
             <w:pPr>
               <w:pStyle w:val="normal1"/>
-              <w:pBdr/>
               <w:shd w:val="clear" w:fill="auto"/>
               <w:spacing w:lineRule="auto" w:line="300" w:before="120" w:after="120"/>
               <w:rPr>
@@ -3728,7 +3920,6 @@
           <w:p>
             <w:pPr>
               <w:pStyle w:val="normal1"/>
-              <w:pBdr/>
               <w:shd w:val="clear" w:fill="auto"/>
               <w:spacing w:lineRule="auto" w:line="300" w:before="120" w:after="120"/>
               <w:rPr>
@@ -3757,7 +3948,6 @@
           <w:p>
             <w:pPr>
               <w:pStyle w:val="normal1"/>
-              <w:pBdr/>
               <w:shd w:val="clear" w:fill="auto"/>
               <w:spacing w:lineRule="auto" w:line="300" w:before="120" w:after="120"/>
               <w:rPr>
@@ -3786,7 +3976,6 @@
           <w:p>
             <w:pPr>
               <w:pStyle w:val="normal1"/>
-              <w:pBdr/>
               <w:shd w:val="clear" w:fill="auto"/>
               <w:spacing w:lineRule="auto" w:line="300" w:before="120" w:after="120"/>
               <w:rPr>
@@ -3815,7 +4004,6 @@
           <w:p>
             <w:pPr>
               <w:pStyle w:val="normal1"/>
-              <w:pBdr/>
               <w:shd w:val="clear" w:fill="auto"/>
               <w:spacing w:lineRule="auto" w:line="300" w:before="120" w:after="120"/>
               <w:rPr>
@@ -3844,7 +4032,6 @@
           <w:p>
             <w:pPr>
               <w:pStyle w:val="normal1"/>
-              <w:pBdr/>
               <w:shd w:val="clear" w:fill="auto"/>
               <w:spacing w:lineRule="auto" w:line="300" w:before="120" w:after="120"/>
               <w:rPr>
@@ -3876,7 +4063,6 @@
           <w:p>
             <w:pPr>
               <w:pStyle w:val="normal1"/>
-              <w:pBdr/>
               <w:shd w:val="clear" w:fill="auto"/>
               <w:spacing w:lineRule="auto" w:line="300" w:before="120" w:after="120"/>
               <w:rPr>
@@ -3911,7 +4097,6 @@
           <w:p>
             <w:pPr>
               <w:pStyle w:val="normal1"/>
-              <w:pBdr/>
               <w:shd w:val="clear" w:fill="auto"/>
               <w:spacing w:lineRule="auto" w:line="300" w:before="120" w:after="120"/>
               <w:rPr>
@@ -3942,7 +4127,6 @@
           <w:p>
             <w:pPr>
               <w:pStyle w:val="normal1"/>
-              <w:pBdr/>
               <w:shd w:val="clear" w:fill="auto"/>
               <w:spacing w:lineRule="auto" w:line="300" w:before="120" w:after="120"/>
               <w:rPr>
@@ -3973,7 +4157,6 @@
           <w:p>
             <w:pPr>
               <w:pStyle w:val="normal1"/>
-              <w:pBdr/>
               <w:shd w:val="clear" w:fill="auto"/>
               <w:spacing w:lineRule="auto" w:line="300" w:before="120" w:after="120"/>
               <w:rPr>
@@ -4004,7 +4187,6 @@
           <w:p>
             <w:pPr>
               <w:pStyle w:val="normal1"/>
-              <w:pBdr/>
               <w:shd w:val="clear" w:fill="auto"/>
               <w:spacing w:lineRule="auto" w:line="300" w:before="120" w:after="120"/>
               <w:rPr>
@@ -4035,7 +4217,6 @@
           <w:p>
             <w:pPr>
               <w:pStyle w:val="normal1"/>
-              <w:pBdr/>
               <w:shd w:val="clear" w:fill="auto"/>
               <w:spacing w:lineRule="auto" w:line="300" w:before="120" w:after="120"/>
               <w:rPr>
@@ -4069,7 +4250,6 @@
           <w:p>
             <w:pPr>
               <w:pStyle w:val="normal1"/>
-              <w:pBdr/>
               <w:shd w:val="clear" w:fill="auto"/>
               <w:spacing w:lineRule="auto" w:line="300" w:before="120" w:after="120"/>
               <w:rPr>
@@ -4102,7 +4282,6 @@
           <w:p>
             <w:pPr>
               <w:pStyle w:val="normal1"/>
-              <w:pBdr/>
               <w:shd w:val="clear" w:fill="auto"/>
               <w:spacing w:lineRule="auto" w:line="300" w:before="120" w:after="120"/>
               <w:rPr>
@@ -4131,7 +4310,6 @@
           <w:p>
             <w:pPr>
               <w:pStyle w:val="normal1"/>
-              <w:pBdr/>
               <w:shd w:val="clear" w:fill="auto"/>
               <w:spacing w:lineRule="auto" w:line="300" w:before="120" w:after="120"/>
               <w:rPr>
@@ -4160,7 +4338,6 @@
           <w:p>
             <w:pPr>
               <w:pStyle w:val="normal1"/>
-              <w:pBdr/>
               <w:shd w:val="clear" w:fill="auto"/>
               <w:spacing w:lineRule="auto" w:line="300" w:before="120" w:after="120"/>
               <w:rPr>
@@ -4189,7 +4366,6 @@
           <w:p>
             <w:pPr>
               <w:pStyle w:val="normal1"/>
-              <w:pBdr/>
               <w:shd w:val="clear" w:fill="auto"/>
               <w:spacing w:lineRule="auto" w:line="300" w:before="120" w:after="120"/>
               <w:rPr>
@@ -4218,7 +4394,6 @@
           <w:p>
             <w:pPr>
               <w:pStyle w:val="normal1"/>
-              <w:pBdr/>
               <w:shd w:val="clear" w:fill="auto"/>
               <w:spacing w:lineRule="auto" w:line="300" w:before="120" w:after="120"/>
               <w:rPr>
@@ -4250,7 +4425,6 @@
           <w:p>
             <w:pPr>
               <w:pStyle w:val="normal1"/>
-              <w:pBdr/>
               <w:shd w:val="clear" w:fill="auto"/>
               <w:spacing w:lineRule="auto" w:line="300" w:before="120" w:after="120"/>
               <w:rPr>
@@ -4285,7 +4459,6 @@
           <w:p>
             <w:pPr>
               <w:pStyle w:val="normal1"/>
-              <w:pBdr/>
               <w:shd w:val="clear" w:fill="auto"/>
               <w:spacing w:lineRule="auto" w:line="300" w:before="120" w:after="120"/>
               <w:rPr>
@@ -4316,7 +4489,6 @@
           <w:p>
             <w:pPr>
               <w:pStyle w:val="normal1"/>
-              <w:pBdr/>
               <w:shd w:val="clear" w:fill="auto"/>
               <w:spacing w:lineRule="auto" w:line="300" w:before="120" w:after="120"/>
               <w:rPr>
@@ -4347,7 +4519,6 @@
           <w:p>
             <w:pPr>
               <w:pStyle w:val="normal1"/>
-              <w:pBdr/>
               <w:shd w:val="clear" w:fill="auto"/>
               <w:spacing w:lineRule="auto" w:line="300" w:before="120" w:after="120"/>
               <w:rPr>
@@ -4378,7 +4549,6 @@
           <w:p>
             <w:pPr>
               <w:pStyle w:val="normal1"/>
-              <w:pBdr/>
               <w:shd w:val="clear" w:fill="auto"/>
               <w:spacing w:lineRule="auto" w:line="300" w:before="120" w:after="120"/>
               <w:rPr>
@@ -4409,7 +4579,6 @@
           <w:p>
             <w:pPr>
               <w:pStyle w:val="normal1"/>
-              <w:pBdr/>
               <w:shd w:val="clear" w:fill="auto"/>
               <w:spacing w:lineRule="auto" w:line="300" w:before="120" w:after="120"/>
               <w:rPr>
@@ -4443,7 +4612,6 @@
           <w:p>
             <w:pPr>
               <w:pStyle w:val="normal1"/>
-              <w:pBdr/>
               <w:shd w:val="clear" w:fill="auto"/>
               <w:spacing w:lineRule="auto" w:line="300" w:before="120" w:after="120"/>
               <w:rPr>
@@ -4476,7 +4644,6 @@
           <w:p>
             <w:pPr>
               <w:pStyle w:val="normal1"/>
-              <w:pBdr/>
               <w:shd w:val="clear" w:fill="auto"/>
               <w:spacing w:lineRule="auto" w:line="300" w:before="120" w:after="120"/>
               <w:rPr>
@@ -4505,7 +4672,6 @@
           <w:p>
             <w:pPr>
               <w:pStyle w:val="normal1"/>
-              <w:pBdr/>
               <w:shd w:val="clear" w:fill="auto"/>
               <w:spacing w:lineRule="auto" w:line="300" w:before="120" w:after="120"/>
               <w:rPr>
@@ -4534,7 +4700,6 @@
           <w:p>
             <w:pPr>
               <w:pStyle w:val="normal1"/>
-              <w:pBdr/>
               <w:shd w:val="clear" w:fill="auto"/>
               <w:spacing w:lineRule="auto" w:line="300" w:before="120" w:after="120"/>
               <w:rPr>
@@ -4563,7 +4728,6 @@
           <w:p>
             <w:pPr>
               <w:pStyle w:val="normal1"/>
-              <w:pBdr/>
               <w:shd w:val="clear" w:fill="auto"/>
               <w:spacing w:lineRule="auto" w:line="300" w:before="120" w:after="120"/>
               <w:rPr>
@@ -4592,7 +4756,6 @@
           <w:p>
             <w:pPr>
               <w:pStyle w:val="normal1"/>
-              <w:pBdr/>
               <w:shd w:val="clear" w:fill="auto"/>
               <w:spacing w:lineRule="auto" w:line="300" w:before="120" w:after="120"/>
               <w:rPr>
@@ -4624,7 +4787,6 @@
           <w:p>
             <w:pPr>
               <w:pStyle w:val="normal1"/>
-              <w:pBdr/>
               <w:shd w:val="clear" w:fill="auto"/>
               <w:spacing w:lineRule="auto" w:line="300" w:before="120" w:after="120"/>
               <w:rPr>
@@ -4659,7 +4821,6 @@
           <w:p>
             <w:pPr>
               <w:pStyle w:val="normal1"/>
-              <w:pBdr/>
               <w:shd w:val="clear" w:fill="auto"/>
               <w:spacing w:lineRule="auto" w:line="300" w:before="120" w:after="120"/>
               <w:rPr>
@@ -4691,7 +4852,6 @@
           <w:p>
             <w:pPr>
               <w:pStyle w:val="normal1"/>
-              <w:pBdr/>
               <w:shd w:val="clear" w:fill="auto"/>
               <w:spacing w:lineRule="auto" w:line="300" w:before="120" w:after="120"/>
               <w:rPr>
@@ -4734,7 +4894,6 @@
           <w:p>
             <w:pPr>
               <w:pStyle w:val="normal1"/>
-              <w:pBdr/>
               <w:shd w:val="clear" w:fill="auto"/>
               <w:spacing w:lineRule="auto" w:line="300" w:before="120" w:after="120"/>
               <w:rPr>
@@ -4767,7 +4926,6 @@
           <w:p>
             <w:pPr>
               <w:pStyle w:val="normal1"/>
-              <w:pBdr/>
               <w:shd w:val="clear" w:fill="auto"/>
               <w:spacing w:lineRule="auto" w:line="300" w:before="120" w:after="120"/>
               <w:rPr>
@@ -4797,8 +4955,8 @@
           <w:p>
             <w:pPr>
               <w:pStyle w:val="normal1"/>
-              <w:pBdr/>
-              <w:shd w:val="clear" w:fill="auto"/>
+              <w:shd w:val="clear" w:fill="auto"/>
+              <w:bidi w:val="0"/>
               <w:spacing w:lineRule="auto" w:line="300" w:before="120" w:after="120"/>
               <w:rPr>
                 <w:rFonts w:ascii="Arial" w:hAnsi="Arial" w:eastAsia="Arial" w:cs="Arial"/>
@@ -4816,7 +4974,7 @@
               <w:rPr>
                 <w:rFonts w:eastAsia="Arial" w:cs="Arial"/>
               </w:rPr>
-              <w:t xml:space="preserve"> Замовник не надав еталонного продукту-конкурента для порівняння метрик продуктивності та часу розрахунку ануїтету. Порівняльні вимірювання не входять до вимог SRS 1.1.</w:t>
+              <w:t xml:space="preserve"> Незастосовно за природою продукту, оскільки у ТЗ та специфікації SRS відсутній регламентований продукт-еталон для прямих порівняльних метрик, а продуктивність оцінюється виключно за абсолютними вимогами P-10 та P-20.</w:t>
             </w:r>
           </w:p>
         </w:tc>
@@ -4825,24 +4983,18 @@
     <w:p>
       <w:pPr>
         <w:pStyle w:val="Heading2"/>
-        <w:pBdr/>
         <w:shd w:val="clear" w:fill="auto"/>
         <w:spacing w:lineRule="auto" w:line="240" w:before="300" w:after="225"/>
         <w:rPr/>
       </w:pPr>
       <w:r>
         <w:rPr/>
-        <w:t>5</w:t>
-      </w:r>
-      <w:r>
-        <w:rPr/>
-        <w:t>. Тестове середовище, тестові дані та аналіз ризиків</w:t>
+        <w:t>5. Тестове середовище, тестові дані та аналіз ризиків</w:t>
       </w:r>
     </w:p>
     <w:p>
       <w:pPr>
         <w:pStyle w:val="normal1"/>
-        <w:pBdr/>
         <w:shd w:val="clear" w:fill="auto"/>
         <w:spacing w:lineRule="auto" w:line="300"/>
         <w:rPr>
@@ -4867,7 +5019,6 @@
           <w:ilvl w:val="0"/>
           <w:numId w:val="5"/>
         </w:numPr>
-        <w:pBdr/>
         <w:shd w:val="clear" w:fill="auto"/>
         <w:spacing w:lineRule="auto" w:line="300"/>
         <w:ind w:hanging="360" w:start="600"/>
@@ -4895,7 +5046,6 @@
           <w:ilvl w:val="0"/>
           <w:numId w:val="5"/>
         </w:numPr>
-        <w:pBdr/>
         <w:shd w:val="clear" w:fill="auto"/>
         <w:spacing w:lineRule="auto" w:line="300"/>
         <w:ind w:hanging="360" w:start="600"/>
@@ -4923,7 +5073,6 @@
           <w:ilvl w:val="0"/>
           <w:numId w:val="5"/>
         </w:numPr>
-        <w:pBdr/>
         <w:shd w:val="clear" w:fill="auto"/>
         <w:spacing w:lineRule="auto" w:line="300"/>
         <w:ind w:hanging="360" w:start="600"/>
@@ -4947,7 +5096,6 @@
     <w:p>
       <w:pPr>
         <w:pStyle w:val="normal1"/>
-        <w:pBdr/>
         <w:shd w:val="clear" w:fill="auto"/>
         <w:spacing w:lineRule="auto" w:line="300"/>
         <w:rPr>
@@ -4972,7 +5120,6 @@
           <w:ilvl w:val="0"/>
           <w:numId w:val="6"/>
         </w:numPr>
-        <w:pBdr/>
         <w:shd w:val="clear" w:fill="auto"/>
         <w:spacing w:lineRule="auto" w:line="300"/>
         <w:ind w:hanging="360" w:start="600"/>
@@ -4992,7 +5139,6 @@
           <w:ilvl w:val="0"/>
           <w:numId w:val="6"/>
         </w:numPr>
-        <w:pBdr/>
         <w:shd w:val="clear" w:fill="auto"/>
         <w:spacing w:lineRule="auto" w:line="300"/>
         <w:ind w:hanging="360" w:start="600"/>
@@ -5012,7 +5158,6 @@
           <w:ilvl w:val="0"/>
           <w:numId w:val="6"/>
         </w:numPr>
-        <w:pBdr/>
         <w:shd w:val="clear" w:fill="auto"/>
         <w:spacing w:lineRule="auto" w:line="300"/>
         <w:ind w:hanging="360" w:start="600"/>
@@ -5032,7 +5177,6 @@
           <w:ilvl w:val="0"/>
           <w:numId w:val="6"/>
         </w:numPr>
-        <w:pBdr/>
         <w:shd w:val="clear" w:fill="auto"/>
         <w:spacing w:lineRule="auto" w:line="300"/>
         <w:ind w:hanging="360" w:start="600"/>
@@ -5048,7 +5192,6 @@
     <w:p>
       <w:pPr>
         <w:pStyle w:val="normal1"/>
-        <w:pBdr/>
         <w:shd w:val="clear" w:fill="auto"/>
         <w:spacing w:lineRule="auto" w:line="300"/>
         <w:rPr>
@@ -5104,7 +5247,6 @@
           <w:p>
             <w:pPr>
               <w:pStyle w:val="normal1"/>
-              <w:pBdr/>
               <w:shd w:val="clear" w:fill="auto"/>
               <w:spacing w:lineRule="auto" w:line="300" w:before="120" w:after="120"/>
               <w:rPr>
@@ -5135,7 +5277,6 @@
           <w:p>
             <w:pPr>
               <w:pStyle w:val="normal1"/>
-              <w:pBdr/>
               <w:shd w:val="clear" w:fill="auto"/>
               <w:spacing w:lineRule="auto" w:line="300" w:before="120" w:after="120"/>
               <w:rPr>
@@ -5166,7 +5307,6 @@
           <w:p>
             <w:pPr>
               <w:pStyle w:val="normal1"/>
-              <w:pBdr/>
               <w:shd w:val="clear" w:fill="auto"/>
               <w:spacing w:lineRule="auto" w:line="300" w:before="120" w:after="120"/>
               <w:rPr>
@@ -5188,7 +5328,6 @@
               <w:keepNext w:val="false"/>
               <w:keepLines w:val="false"/>
               <w:widowControl w:val="false"/>
-              <w:pBdr/>
               <w:shd w:val="clear" w:fill="auto"/>
               <w:spacing w:lineRule="auto" w:line="240" w:before="0" w:after="0"/>
               <w:ind w:hanging="0" w:start="0" w:end="0"/>
@@ -5222,7 +5361,6 @@
           <w:p>
             <w:pPr>
               <w:pStyle w:val="normal1"/>
-              <w:pBdr/>
               <w:shd w:val="clear" w:fill="auto"/>
               <w:spacing w:lineRule="auto" w:line="300" w:before="120" w:after="120"/>
               <w:rPr>
@@ -5251,7 +5389,6 @@
           <w:p>
             <w:pPr>
               <w:pStyle w:val="normal1"/>
-              <w:pBdr/>
               <w:shd w:val="clear" w:fill="auto"/>
               <w:spacing w:lineRule="auto" w:line="300" w:before="120" w:after="120"/>
               <w:rPr>
@@ -5280,7 +5417,6 @@
           <w:p>
             <w:pPr>
               <w:pStyle w:val="normal1"/>
-              <w:pBdr/>
               <w:shd w:val="clear" w:fill="auto"/>
               <w:spacing w:lineRule="auto" w:line="300" w:before="120" w:after="120"/>
               <w:rPr>
@@ -5312,7 +5448,6 @@
           <w:p>
             <w:pPr>
               <w:pStyle w:val="normal1"/>
-              <w:pBdr/>
               <w:shd w:val="clear" w:fill="auto"/>
               <w:spacing w:lineRule="auto" w:line="300" w:before="120" w:after="120"/>
               <w:rPr>
@@ -5343,7 +5478,6 @@
           <w:p>
             <w:pPr>
               <w:pStyle w:val="normal1"/>
-              <w:pBdr/>
               <w:shd w:val="clear" w:fill="auto"/>
               <w:spacing w:lineRule="auto" w:line="300" w:before="120" w:after="120"/>
               <w:rPr>
@@ -5374,7 +5508,6 @@
           <w:p>
             <w:pPr>
               <w:pStyle w:val="normal1"/>
-              <w:pBdr/>
               <w:shd w:val="clear" w:fill="auto"/>
               <w:spacing w:lineRule="auto" w:line="300" w:before="120" w:after="120"/>
               <w:rPr>
@@ -5408,7 +5541,6 @@
           <w:p>
             <w:pPr>
               <w:pStyle w:val="normal1"/>
-              <w:pBdr/>
               <w:shd w:val="clear" w:fill="auto"/>
               <w:spacing w:lineRule="auto" w:line="300" w:before="120" w:after="120"/>
               <w:rPr>
@@ -5437,7 +5569,6 @@
           <w:p>
             <w:pPr>
               <w:pStyle w:val="normal1"/>
-              <w:pBdr/>
               <w:shd w:val="clear" w:fill="auto"/>
               <w:spacing w:lineRule="auto" w:line="300" w:before="120" w:after="120"/>
               <w:rPr>
@@ -5466,7 +5597,6 @@
           <w:p>
             <w:pPr>
               <w:pStyle w:val="normal1"/>
-              <w:pBdr/>
               <w:shd w:val="clear" w:fill="auto"/>
               <w:spacing w:lineRule="auto" w:line="300" w:before="120" w:after="120"/>
               <w:rPr>
@@ -5490,7 +5620,6 @@
         <w:keepLines w:val="false"/>
         <w:pageBreakBefore w:val="false"/>
         <w:widowControl w:val="false"/>
-        <w:pBdr/>
         <w:shd w:val="clear" w:fill="auto"/>
         <w:spacing w:lineRule="auto" w:line="276" w:before="0" w:after="0"/>
         <w:ind w:hanging="0" w:start="0" w:end="0"/>
@@ -7316,6 +7445,7 @@
     <w:name w:val="Normal"/>
     <w:pPr>
       <w:widowControl w:val="false"/>
+      <w:suppressAutoHyphens w:val="true"/>
       <w:bidi w:val="0"/>
       <w:spacing w:before="0" w:after="0"/>
       <w:jc w:val="start"/>
@@ -7334,7 +7464,6 @@
     <w:basedOn w:val="normal1"/>
     <w:next w:val="normal1"/>
     <w:pPr>
-      <w:pBdr/>
       <w:shd w:val="clear" w:fill="auto"/>
       <w:spacing w:lineRule="auto" w:line="240" w:before="240" w:after="240"/>
     </w:pPr>
@@ -7352,7 +7481,6 @@
     <w:basedOn w:val="normal1"/>
     <w:next w:val="normal1"/>
     <w:pPr>
-      <w:pBdr/>
       <w:shd w:val="clear" w:fill="auto"/>
       <w:spacing w:lineRule="auto" w:line="240" w:before="225" w:after="225"/>
     </w:pPr>
@@ -7370,7 +7498,6 @@
     <w:basedOn w:val="normal1"/>
     <w:next w:val="normal1"/>
     <w:pPr>
-      <w:pBdr/>
       <w:shd w:val="clear" w:fill="auto"/>
       <w:spacing w:lineRule="auto" w:line="240" w:before="240" w:after="240"/>
     </w:pPr>
@@ -7388,7 +7515,6 @@
     <w:basedOn w:val="normal1"/>
     <w:next w:val="normal1"/>
     <w:pPr>
-      <w:pBdr/>
       <w:shd w:val="clear" w:fill="auto"/>
       <w:spacing w:lineRule="auto" w:line="240" w:before="255" w:after="255"/>
     </w:pPr>
@@ -7406,7 +7532,6 @@
     <w:basedOn w:val="normal1"/>
     <w:next w:val="normal1"/>
     <w:pPr>
-      <w:pBdr/>
       <w:shd w:val="clear" w:fill="auto"/>
       <w:spacing w:lineRule="auto" w:line="240" w:before="255" w:after="255"/>
     </w:pPr>
@@ -7424,7 +7549,6 @@
     <w:basedOn w:val="normal1"/>
     <w:next w:val="normal1"/>
     <w:pPr>
-      <w:pBdr/>
       <w:shd w:val="clear" w:fill="auto"/>
       <w:spacing w:lineRule="auto" w:line="240" w:before="360" w:after="360"/>
     </w:pPr>
@@ -7496,6 +7620,7 @@
     <w:name w:val="normal1"/>
     <w:pPr>
       <w:widowControl w:val="false"/>
+      <w:suppressAutoHyphens w:val="true"/>
       <w:bidi w:val="0"/>
       <w:spacing w:before="0" w:after="0"/>
       <w:jc w:val="start"/>
@@ -7543,6 +7668,23 @@
       <w:color w:val="666666"/>
       <w:sz w:val="48"/>
       <w:szCs w:val="48"/>
+    </w:rPr>
+  </w:style>
+  <w:style w:type="paragraph" w:styleId="normal2">
+    <w:name w:val="normal2"/>
+    <w:pPr>
+      <w:widowControl w:val="false"/>
+      <w:bidi w:val="0"/>
+      <w:spacing w:before="0" w:after="0"/>
+      <w:jc w:val="start"/>
+    </w:pPr>
+    <w:rPr>
+      <w:rFonts w:ascii="Arial" w:hAnsi="Arial" w:eastAsia="Arial" w:cs="Arial"/>
+      <w:color w:val="auto"/>
+      <w:kern w:val="0"/>
+      <w:sz w:val="22"/>
+      <w:szCs w:val="22"/>
+      <w:lang w:val="en-US" w:eastAsia="zh-CN" w:bidi="hi-IN"/>
     </w:rPr>
   </w:style>
   <w:style w:type="table" w:default="1" w:styleId="TableNormal">

</xml_diff>